<commit_message>
Design improvements and documentation updates
</commit_message>
<xml_diff>
--- a/decision_intelligence/bias-aware-decision-making-rag-copilot/docs/Solution_Design_Document.docx
+++ b/decision_intelligence/bias-aware-decision-making-rag-copilot/docs/Solution_Design_Document.docx
@@ -114,12 +114,6 @@
         <w:gridCol w:w="3200"/>
       </w:tblGrid>
       <w:tr>
-        <w:tblPrEx>
-          <w:tblCellMar>
-            <w:top w:w="0" w:type="dxa"/>
-            <w:bottom w:w="0" w:type="dxa"/>
-          </w:tblCellMar>
-        </w:tblPrEx>
         <w:tc>
           <w:tcPr>
             <w:tcW w:w="2200" w:type="dxa"/>
@@ -179,12 +173,6 @@
         </w:tc>
       </w:tr>
       <w:tr>
-        <w:tblPrEx>
-          <w:tblCellMar>
-            <w:top w:w="0" w:type="dxa"/>
-            <w:bottom w:w="0" w:type="dxa"/>
-          </w:tblCellMar>
-        </w:tblPrEx>
         <w:tc>
           <w:tcPr>
             <w:tcW w:w="2200" w:type="dxa"/>
@@ -244,12 +232,6 @@
         </w:tc>
       </w:tr>
       <w:tr>
-        <w:tblPrEx>
-          <w:tblCellMar>
-            <w:top w:w="0" w:type="dxa"/>
-            <w:bottom w:w="0" w:type="dxa"/>
-          </w:tblCellMar>
-        </w:tblPrEx>
         <w:tc>
           <w:tcPr>
             <w:tcW w:w="2200" w:type="dxa"/>
@@ -309,12 +291,6 @@
         </w:tc>
       </w:tr>
       <w:tr>
-        <w:tblPrEx>
-          <w:tblCellMar>
-            <w:top w:w="0" w:type="dxa"/>
-            <w:bottom w:w="0" w:type="dxa"/>
-          </w:tblCellMar>
-        </w:tblPrEx>
         <w:tc>
           <w:tcPr>
             <w:tcW w:w="2200" w:type="dxa"/>
@@ -442,12 +418,6 @@
         <w:gridCol w:w="7080"/>
       </w:tblGrid>
       <w:tr>
-        <w:tblPrEx>
-          <w:tblCellMar>
-            <w:top w:w="0" w:type="dxa"/>
-            <w:bottom w:w="0" w:type="dxa"/>
-          </w:tblCellMar>
-        </w:tblPrEx>
         <w:trPr>
           <w:tblHeader/>
         </w:trPr>
@@ -543,12 +513,6 @@
         </w:tc>
       </w:tr>
       <w:tr>
-        <w:tblPrEx>
-          <w:tblCellMar>
-            <w:top w:w="0" w:type="dxa"/>
-            <w:bottom w:w="0" w:type="dxa"/>
-          </w:tblCellMar>
-        </w:tblPrEx>
         <w:tc>
           <w:tcPr>
             <w:tcW w:w="1200" w:type="dxa"/>
@@ -632,12 +596,6 @@
         </w:tc>
       </w:tr>
       <w:tr>
-        <w:tblPrEx>
-          <w:tblCellMar>
-            <w:top w:w="0" w:type="dxa"/>
-            <w:bottom w:w="0" w:type="dxa"/>
-          </w:tblCellMar>
-        </w:tblPrEx>
         <w:tc>
           <w:tcPr>
             <w:tcW w:w="1200" w:type="dxa"/>
@@ -721,12 +679,6 @@
         </w:tc>
       </w:tr>
       <w:tr>
-        <w:tblPrEx>
-          <w:tblCellMar>
-            <w:top w:w="0" w:type="dxa"/>
-            <w:bottom w:w="0" w:type="dxa"/>
-          </w:tblCellMar>
-        </w:tblPrEx>
         <w:tc>
           <w:tcPr>
             <w:tcW w:w="1200" w:type="dxa"/>
@@ -886,12 +838,6 @@
         <w:gridCol w:w="10080"/>
       </w:tblGrid>
       <w:tr>
-        <w:tblPrEx>
-          <w:tblCellMar>
-            <w:top w:w="0" w:type="dxa"/>
-            <w:bottom w:w="0" w:type="dxa"/>
-          </w:tblCellMar>
-        </w:tblPrEx>
         <w:tc>
           <w:tcPr>
             <w:tcW w:w="10080" w:type="dxa"/>
@@ -1036,12 +982,6 @@
         <w:gridCol w:w="10080"/>
       </w:tblGrid>
       <w:tr>
-        <w:tblPrEx>
-          <w:tblCellMar>
-            <w:top w:w="0" w:type="dxa"/>
-            <w:bottom w:w="0" w:type="dxa"/>
-          </w:tblCellMar>
-        </w:tblPrEx>
         <w:tc>
           <w:tcPr>
             <w:tcW w:w="10080" w:type="dxa"/>
@@ -1183,6 +1123,46 @@
     </w:p>
     <w:p>
       <w:pPr>
+        <w:spacing w:after="200"/>
+      </w:pPr>
+    </w:p>
+    <w:p>
+      <w:pPr>
+        <w:spacing w:after="200"/>
+      </w:pPr>
+    </w:p>
+    <w:p>
+      <w:pPr>
+        <w:spacing w:after="200"/>
+      </w:pPr>
+    </w:p>
+    <w:p>
+      <w:pPr>
+        <w:spacing w:after="200"/>
+      </w:pPr>
+    </w:p>
+    <w:p>
+      <w:pPr>
+        <w:spacing w:after="200"/>
+      </w:pPr>
+    </w:p>
+    <w:p>
+      <w:pPr>
+        <w:spacing w:after="200"/>
+      </w:pPr>
+    </w:p>
+    <w:p>
+      <w:pPr>
+        <w:spacing w:after="200"/>
+      </w:pPr>
+    </w:p>
+    <w:p>
+      <w:pPr>
+        <w:spacing w:after="200"/>
+      </w:pPr>
+    </w:p>
+    <w:p>
+      <w:pPr>
         <w:pStyle w:val="Heading1"/>
         <w:spacing w:before="320"/>
       </w:pPr>
@@ -1210,7 +1190,9 @@
         <w:jc w:val="center"/>
       </w:pPr>
       <w:r>
-        <w:lastRenderedPageBreak/>
+        <w:rPr>
+          <w:noProof/>
+        </w:rPr>
         <w:drawing>
           <wp:inline distT="0" distB="0" distL="0" distR="0" wp14:anchorId="40E0949B" wp14:editId="7DF91B86">
             <wp:extent cx="6400800" cy="2560320"/>
@@ -1348,10 +1330,2641 @@
     </w:p>
     <w:p>
       <w:pPr>
+        <w:spacing w:after="200"/>
+      </w:pPr>
+    </w:p>
+    <w:p>
+      <w:pPr>
+        <w:spacing w:after="200"/>
+      </w:pPr>
+    </w:p>
+    <w:p>
+      <w:pPr>
+        <w:spacing w:after="200"/>
+      </w:pPr>
+    </w:p>
+    <w:p>
+      <w:pPr>
+        <w:spacing w:after="200"/>
+      </w:pPr>
+    </w:p>
+    <w:p>
+      <w:pPr>
+        <w:spacing w:after="200"/>
+      </w:pPr>
+    </w:p>
+    <w:p>
+      <w:pPr>
+        <w:spacing w:after="200"/>
+      </w:pPr>
+    </w:p>
+    <w:p>
+      <w:pPr>
+        <w:spacing w:after="200"/>
+      </w:pPr>
+    </w:p>
+    <w:p>
+      <w:pPr>
+        <w:spacing w:after="160"/>
+      </w:pPr>
+    </w:p>
+    <w:p>
+      <w:pPr>
         <w:pStyle w:val="Heading1"/>
         <w:spacing w:before="320"/>
       </w:pPr>
       <w:r>
+        <w:t>Information Retrieval Techniques</w:t>
+      </w:r>
+    </w:p>
+    <w:p>
+      <w:pPr>
+        <w:spacing w:after="160"/>
+      </w:pPr>
+      <w:r>
+        <w:t>Basic vector similarity search is effective for simple queries but has two well-documented failure modes in production RAG systems: result redundancy (top-K chunks from the same source repeating the same argument) and retrieval mismatch (semantic search missing exact-term queries; keyword search missing paraphrased intent). The retrieval stack in this solution addresses both through four complementary techniques — each grounded in published research and implemented in rag/retriever.py.</w:t>
+      </w:r>
+    </w:p>
+    <w:p>
+      <w:pPr>
+        <w:pStyle w:val="Heading2"/>
+      </w:pPr>
+      <w:r>
+        <w:t>1. Maximal Marginal Relevance (MMR)</w:t>
+      </w:r>
+    </w:p>
+    <w:p>
+      <w:pPr>
+        <w:spacing w:after="140"/>
+      </w:pPr>
+      <w:r>
+        <w:t>Origin and scholarly basis: MMR was introduced by Carbonell and Goldstein (1998) in their SIGIR paper “The Use of MMR, Diversity-Based Reranking for Reordering Documents and Producing Summaries” (Carnegie Mellon University / ACL Anthology). The algorithm has accumulated over 1,000 citations and has seen renewed significance since 2023 as the default diversity mechanism in RAG vector stores including FAISS, Elasticsearch, OpenSearch, and Azure AI Search.</w:t>
+      </w:r>
+    </w:p>
+    <w:p>
+      <w:pPr>
+        <w:pStyle w:val="Heading3"/>
+      </w:pPr>
+      <w:r>
+        <w:t>How MMR Works</w:t>
+      </w:r>
+    </w:p>
+    <w:p>
+      <w:pPr>
+        <w:spacing w:after="100"/>
+      </w:pPr>
+      <w:r>
+        <w:t>MMR selects documents iteratively. At each step it scores every candidate document by a weighted combination of two signals: its cosine similarity to the query, and the maximum cosine similarity it shares with any document already selected. The formula is:</w:t>
+      </w:r>
+    </w:p>
+    <w:p>
+      <w:pPr>
+        <w:spacing w:after="120"/>
+      </w:pPr>
+      <w:r>
+        <w:rPr>
+          <w:b/>
+        </w:rPr>
+        <w:t>MMR = argmax [ λ × Sim₁(dᵢ, query) − (1 − λ) × max Sim₂(dᵢ, dⱼ) ]</w:t>
+      </w:r>
+    </w:p>
+    <w:p>
+      <w:pPr>
+        <w:spacing w:after="100"/>
+      </w:pPr>
+      <w:r>
+        <w:t>where λ ∈ [0, 1] is the diversity-relevance trade-off parameter. When λ = 1 MMR reduces to pure similarity search. When λ = 0 it selects maximally diverse documents regardless of relevance. Practical guidance (Elasticsearch Labs, 2025; ESPC / Azure AI Search, 2024) recommends:</w:t>
+      </w:r>
+    </w:p>
+    <w:p>
+      <w:pPr>
+        <w:numPr>
+          <w:ilvl w:val="0"/>
+          <w:numId w:val="1"/>
+        </w:numPr>
+        <w:spacing w:after="80"/>
+      </w:pPr>
+      <w:r>
+        <w:t>λ = 0.7–0.9 — high relevance, low diversity: precise factual queries where the user knows exactly what they want.</w:t>
+      </w:r>
+    </w:p>
+    <w:p>
+      <w:pPr>
+        <w:numPr>
+          <w:ilvl w:val="0"/>
+          <w:numId w:val="1"/>
+        </w:numPr>
+        <w:spacing w:after="80"/>
+      </w:pPr>
+      <w:r>
+        <w:t>λ = 0.5–0.7 — balanced: research and analysis tasks requiring broad coverage (default in this solution: 0.7 via RAG_MMR_LAMBDA).</w:t>
+      </w:r>
+    </w:p>
+    <w:p>
+      <w:pPr>
+        <w:numPr>
+          <w:ilvl w:val="0"/>
+          <w:numId w:val="1"/>
+        </w:numPr>
+        <w:spacing w:after="80"/>
+      </w:pPr>
+      <w:r>
+        <w:t>λ = 0.3–0.5 — high diversity, lower relevance ceiling: exploratory or open-ended discovery queries.</w:t>
+      </w:r>
+    </w:p>
+    <w:p>
+      <w:pPr>
+        <w:spacing w:after="80"/>
+      </w:pPr>
+    </w:p>
+    <w:p>
+      <w:pPr>
+        <w:spacing w:after="80"/>
+      </w:pPr>
+    </w:p>
+    <w:p>
+      <w:pPr>
+        <w:spacing w:after="80"/>
+      </w:pPr>
+    </w:p>
+    <w:p>
+      <w:pPr>
+        <w:spacing w:after="80"/>
+      </w:pPr>
+    </w:p>
+    <w:p>
+      <w:pPr>
+        <w:spacing w:after="80"/>
+      </w:pPr>
+    </w:p>
+    <w:p>
+      <w:pPr>
+        <w:spacing w:after="80"/>
+      </w:pPr>
+    </w:p>
+    <w:p>
+      <w:pPr>
+        <w:spacing w:after="80"/>
+      </w:pPr>
+    </w:p>
+    <w:p>
+      <w:pPr>
+        <w:spacing w:after="80"/>
+      </w:pPr>
+    </w:p>
+    <w:p>
+      <w:pPr>
+        <w:spacing w:after="80"/>
+      </w:pPr>
+    </w:p>
+    <w:p>
+      <w:pPr>
+        <w:spacing w:after="80"/>
+      </w:pPr>
+    </w:p>
+    <w:p>
+      <w:pPr>
+        <w:spacing w:after="80"/>
+      </w:pPr>
+    </w:p>
+    <w:p>
+      <w:pPr>
+        <w:spacing w:after="80"/>
+      </w:pPr>
+    </w:p>
+    <w:p>
+      <w:pPr>
+        <w:spacing w:after="80"/>
+      </w:pPr>
+    </w:p>
+    <w:p>
+      <w:pPr>
+        <w:pStyle w:val="Heading3"/>
+      </w:pPr>
+      <w:r>
+        <w:t>Why MMR Matters for Bias Analysis</w:t>
+      </w:r>
+    </w:p>
+    <w:p>
+      <w:pPr>
+        <w:spacing w:after="140"/>
+      </w:pPr>
+      <w:r>
+        <w:t>Cognitive bias literature is inherently multi-perspective: confirmation bias, anchoring, and framing often co-occur in a single scenario. Without MMR, top-K retrieval tends to surface multiple excerpts from the same dossier, providing the LLM with a narrow evidentiary base. With MMR at λ = 0.7, the final context window contains contributions from multiple source documents and authors, reducing the risk of a single-source echo chamber in the bias analysis.</w:t>
+      </w:r>
+    </w:p>
+    <w:p>
+      <w:pPr>
+        <w:spacing w:after="140"/>
+      </w:pPr>
+    </w:p>
+    <w:tbl>
+      <w:tblPr>
+        <w:tblW w:w="10080" w:type="dxa"/>
+        <w:tblBorders>
+          <w:top w:val="single" w:sz="4" w:space="0" w:color="1E4078"/>
+          <w:left w:val="single" w:sz="4" w:space="0" w:color="1E4078"/>
+          <w:bottom w:val="single" w:sz="4" w:space="0" w:color="1E4078"/>
+          <w:right w:val="single" w:sz="4" w:space="0" w:color="1E4078"/>
+        </w:tblBorders>
+        <w:tblLook w:val="04A0" w:firstRow="1" w:lastRow="0" w:firstColumn="1" w:lastColumn="0" w:noHBand="0" w:noVBand="1"/>
+      </w:tblPr>
+      <w:tblGrid>
+        <w:gridCol w:w="10080"/>
+      </w:tblGrid>
+      <w:tr>
+        <w:tc>
+          <w:tcPr>
+            <w:tcW w:w="10080" w:type="dxa"/>
+            <w:shd w:val="clear" w:color="auto" w:fill="D5E8F5"/>
+            <w:tcMar>
+              <w:top w:w="100" w:type="dxa"/>
+              <w:left w:w="160" w:type="dxa"/>
+              <w:bottom w:w="100" w:type="dxa"/>
+              <w:right w:w="160" w:type="dxa"/>
+            </w:tcMar>
+          </w:tcPr>
+          <w:p>
+            <w:pPr>
+              <w:spacing w:after="80"/>
+            </w:pPr>
+            <w:r>
+              <w:rPr>
+                <w:b/>
+                <w:color w:val="1E4078"/>
+              </w:rPr>
+              <w:t>MMR — Key Properties</w:t>
+            </w:r>
+          </w:p>
+          <w:p>
+            <w:pPr>
+              <w:numPr>
+                <w:ilvl w:val="0"/>
+                <w:numId w:val="1"/>
+              </w:numPr>
+              <w:spacing w:after="60"/>
+            </w:pPr>
+            <w:r>
+              <w:rPr>
+                <w:sz w:val="20"/>
+              </w:rPr>
+              <w:t>Grounded in Carbonell &amp; Goldstein (SIGIR 1998); 1,000+ citations; integrated natively in FAISS, Elasticsearch, OpenSearch, and Azure AI Search.</w:t>
+            </w:r>
+          </w:p>
+          <w:p>
+            <w:pPr>
+              <w:numPr>
+                <w:ilvl w:val="0"/>
+                <w:numId w:val="1"/>
+              </w:numPr>
+              <w:spacing w:after="60"/>
+            </w:pPr>
+            <w:r>
+              <w:rPr>
+                <w:sz w:val="20"/>
+              </w:rPr>
+              <w:t>Controlled by a single parameter (λ). In this solution RAG_MMR_LAMBDA defaults to 0.7 and is overridable per deployment without code changes.</w:t>
+            </w:r>
+          </w:p>
+          <w:p>
+            <w:pPr>
+              <w:numPr>
+                <w:ilvl w:val="0"/>
+                <w:numId w:val="1"/>
+              </w:numPr>
+              <w:spacing w:after="60"/>
+            </w:pPr>
+            <w:r>
+              <w:rPr>
+                <w:sz w:val="20"/>
+              </w:rPr>
+              <w:t>Applied as a post-retrieval re-ranking step: a larger candidate pool (RAG_RERANKER_CANDIDATES) is fetched first, then MMR cuts it to top-K.</w:t>
+            </w:r>
+          </w:p>
+          <w:p>
+            <w:pPr>
+              <w:numPr>
+                <w:ilvl w:val="0"/>
+                <w:numId w:val="1"/>
+              </w:numPr>
+              <w:spacing w:after="60"/>
+            </w:pPr>
+            <w:r>
+              <w:rPr>
+                <w:sz w:val="20"/>
+              </w:rPr>
+              <w:t>Diminishing returns beyond top-K ≈ 10; increasing the candidate pool improves quality more than increasing K.</w:t>
+            </w:r>
+          </w:p>
+        </w:tc>
+      </w:tr>
+    </w:tbl>
+    <w:p>
+      <w:pPr>
+        <w:spacing w:after="200"/>
+      </w:pPr>
+    </w:p>
+    <w:p>
+      <w:pPr>
+        <w:pStyle w:val="Heading2"/>
+      </w:pPr>
+      <w:r>
+        <w:t>2. Self-Querying Retrievers</w:t>
+      </w:r>
+    </w:p>
+    <w:p>
+      <w:pPr>
+        <w:spacing w:after="140"/>
+      </w:pPr>
+      <w:r>
+        <w:t>A Self-Querying Retriever uses the language model itself to parse a natural-language query into two components: a semantic search string and a structured metadata filter expression. Rather than relying on the user to phrase their query in a way that matches indexed metadata fields, the retriever infers the appropriate filter automatically. LangChain’s 2023 State of AI survey ranked self-querying among the top six most widely used retrieval strategies in production RAG systems.</w:t>
+      </w:r>
+    </w:p>
+    <w:p>
+      <w:pPr>
+        <w:pStyle w:val="Heading3"/>
+      </w:pPr>
+      <w:r>
+        <w:t>How Self-Querying Works</w:t>
+      </w:r>
+    </w:p>
+    <w:p>
+      <w:pPr>
+        <w:spacing w:after="80"/>
+      </w:pPr>
+      <w:r>
+        <w:t>When a query arrives, the LLM acts as a structured query parser. It receives a description of the available metadata fields (e.g., author, publication_year, decision_phase, passage_type) and the user’s natural-language input. It produces a structured output containing:</w:t>
+      </w:r>
+    </w:p>
+    <w:p>
+      <w:pPr>
+        <w:numPr>
+          <w:ilvl w:val="0"/>
+          <w:numId w:val="1"/>
+        </w:numPr>
+        <w:spacing w:after="80"/>
+      </w:pPr>
+      <w:r>
+        <w:t>A reformulated semantic search string optimised for vector similarity (e.g., stripped of date/author qualifiers that would confuse embedding distance).</w:t>
+      </w:r>
+    </w:p>
+    <w:p>
+      <w:pPr>
+        <w:numPr>
+          <w:ilvl w:val="0"/>
+          <w:numId w:val="1"/>
+        </w:numPr>
+        <w:spacing w:after="80"/>
+      </w:pPr>
+      <w:r>
+        <w:t>A metadata filter expression using comparators supported by the vector store (e.g., year &gt; 2018 AND passage_type = "empirical").</w:t>
+      </w:r>
+    </w:p>
+    <w:p>
+      <w:pPr>
+        <w:numPr>
+          <w:ilvl w:val="0"/>
+          <w:numId w:val="1"/>
+        </w:numPr>
+        <w:spacing w:after="80"/>
+      </w:pPr>
+      <w:r>
+        <w:t>The vector store then executes both components in a single pass: metadata pre-filter narrows the candidate set, then vector search ranks within that set.</w:t>
+      </w:r>
+    </w:p>
+    <w:p>
+      <w:pPr>
+        <w:spacing w:after="140"/>
+      </w:pPr>
+      <w:r>
+        <w:t>Elasticsearch Labs (2025) describes this as “bridging the gap between natural language queries and structured metadata filtering” — where pure keyword or semantic search alone falls short because the query contains both intent (what the document should be about) and constraints (who wrote it, when, for which decision stage).</w:t>
+      </w:r>
+    </w:p>
+    <w:p>
+      <w:pPr>
+        <w:pStyle w:val="Heading3"/>
+      </w:pPr>
+    </w:p>
+    <w:p>
+      <w:pPr>
+        <w:pStyle w:val="Heading3"/>
+      </w:pPr>
+    </w:p>
+    <w:p>
+      <w:pPr>
+        <w:pStyle w:val="Heading3"/>
+      </w:pPr>
+    </w:p>
+    <w:p>
+      <w:pPr>
+        <w:pStyle w:val="Heading3"/>
+      </w:pPr>
+    </w:p>
+    <w:p>
+      <w:pPr>
+        <w:pStyle w:val="Heading3"/>
+      </w:pPr>
+      <w:r>
+        <w:t>Relevance to This Solution</w:t>
+      </w:r>
+    </w:p>
+    <w:p>
+      <w:pPr>
+        <w:spacing w:after="140"/>
+      </w:pPr>
+      <w:r>
+        <w:t>Each chunk in this system carries 20+ metadata fields including author, publication_year, decision_phase, passage_type, decision_domains, and concepts. A self-querying retriever would allow queries such as “recent empirical evidence on confirmation bias in hiring decisions” to be decomposed automatically into a semantic search on confirmation bias combined with filters passage_type = empirical AND decision_phase = evaluation. This is identified as a Phase 5 roadmap item (see Engineering Roadmap).</w:t>
+      </w:r>
+    </w:p>
+    <w:tbl>
+      <w:tblPr>
+        <w:tblW w:w="10080" w:type="dxa"/>
+        <w:tblBorders>
+          <w:top w:val="single" w:sz="4" w:space="0" w:color="27785F"/>
+          <w:left w:val="single" w:sz="4" w:space="0" w:color="27785F"/>
+          <w:bottom w:val="single" w:sz="4" w:space="0" w:color="27785F"/>
+          <w:right w:val="single" w:sz="4" w:space="0" w:color="27785F"/>
+        </w:tblBorders>
+        <w:tblLook w:val="04A0" w:firstRow="1" w:lastRow="0" w:firstColumn="1" w:lastColumn="0" w:noHBand="0" w:noVBand="1"/>
+      </w:tblPr>
+      <w:tblGrid>
+        <w:gridCol w:w="10080"/>
+      </w:tblGrid>
+      <w:tr>
+        <w:tc>
+          <w:tcPr>
+            <w:tcW w:w="10080" w:type="dxa"/>
+            <w:shd w:val="clear" w:color="auto" w:fill="D0EFE0"/>
+            <w:tcMar>
+              <w:top w:w="100" w:type="dxa"/>
+              <w:left w:w="160" w:type="dxa"/>
+              <w:bottom w:w="100" w:type="dxa"/>
+              <w:right w:w="160" w:type="dxa"/>
+            </w:tcMar>
+          </w:tcPr>
+          <w:p>
+            <w:pPr>
+              <w:spacing w:after="80"/>
+            </w:pPr>
+            <w:r>
+              <w:rPr>
+                <w:b/>
+                <w:color w:val="27785F"/>
+              </w:rPr>
+              <w:t>Self-Querying — Key Properties</w:t>
+            </w:r>
+          </w:p>
+          <w:p>
+            <w:pPr>
+              <w:numPr>
+                <w:ilvl w:val="0"/>
+                <w:numId w:val="1"/>
+              </w:numPr>
+              <w:spacing w:after="60"/>
+            </w:pPr>
+            <w:r>
+              <w:rPr>
+                <w:sz w:val="20"/>
+              </w:rPr>
+              <w:t>Combines semantic similarity search with structured metadata filtering in a single retrieval pass.</w:t>
+            </w:r>
+          </w:p>
+          <w:p>
+            <w:pPr>
+              <w:numPr>
+                <w:ilvl w:val="0"/>
+                <w:numId w:val="1"/>
+              </w:numPr>
+              <w:spacing w:after="60"/>
+            </w:pPr>
+            <w:r>
+              <w:rPr>
+                <w:sz w:val="20"/>
+              </w:rPr>
+              <w:t>Requires the vector store to support metadata filtering comparators; FAISS (in-memory) does not natively; a migration to OpenSearch or Pinecone would unlock this.</w:t>
+            </w:r>
+          </w:p>
+          <w:p>
+            <w:pPr>
+              <w:numPr>
+                <w:ilvl w:val="0"/>
+                <w:numId w:val="1"/>
+              </w:numPr>
+              <w:spacing w:after="60"/>
+            </w:pPr>
+            <w:r>
+              <w:rPr>
+                <w:sz w:val="20"/>
+              </w:rPr>
+              <w:t>Particularly valuable when queries mix topical intent with constraints on author, date, source type, or decision phase.</w:t>
+            </w:r>
+          </w:p>
+          <w:p>
+            <w:pPr>
+              <w:numPr>
+                <w:ilvl w:val="0"/>
+                <w:numId w:val="1"/>
+              </w:numPr>
+              <w:spacing w:after="60"/>
+            </w:pPr>
+            <w:r>
+              <w:rPr>
+                <w:sz w:val="20"/>
+              </w:rPr>
+              <w:t>LLM parsing overhead adds one extra inference call per query; mitigated by using a fast model (e.g., Claude Haiku) for the query-parsing step.</w:t>
+            </w:r>
+          </w:p>
+          <w:p>
+            <w:pPr>
+              <w:numPr>
+                <w:ilvl w:val="0"/>
+                <w:numId w:val="1"/>
+              </w:numPr>
+              <w:spacing w:after="60"/>
+            </w:pPr>
+            <w:r>
+              <w:rPr>
+                <w:sz w:val="20"/>
+              </w:rPr>
+              <w:t>Roadmap: implement once metadata ACL fields are added and a managed vector store replaces in-process FAISS.</w:t>
+            </w:r>
+          </w:p>
+        </w:tc>
+      </w:tr>
+    </w:tbl>
+    <w:p>
+      <w:pPr>
+        <w:spacing w:after="200"/>
+      </w:pPr>
+    </w:p>
+    <w:p>
+      <w:pPr>
+        <w:pStyle w:val="Heading2"/>
+      </w:pPr>
+      <w:r>
+        <w:t>3. Contextual Compression</w:t>
+      </w:r>
+    </w:p>
+    <w:p>
+      <w:pPr>
+        <w:spacing w:after="140"/>
+      </w:pPr>
+      <w:r>
+        <w:t>Retrieved chunks often contain more text than is relevant to the query. Passing full chunks to the LLM consumes context-window tokens, increases inference cost, and — critically — introduces noise that can dilute or distract from the most pertinent evidence. Contextual compression is the post-retrieval step that reduces each retrieved passage to only the content most relevant to the current query before it enters the prompt.</w:t>
+      </w:r>
+    </w:p>
+    <w:p>
+      <w:pPr>
+        <w:spacing w:after="140"/>
+      </w:pPr>
+      <w:r>
+        <w:t>Scholarly grounding: Verma (2024), “Contextual Compression in Retrieval-Augmented Generation for Large Language Models: A Survey” (arXiv:2409.13385), provides a comprehensive taxonomy of compression paradigms. The survey establishes that contextual compression addresses the three core RAG limitations it was designed to solve: limited context-window capacity, irrelevant information in retrieved passages, and high processing overhead for extensive contextual data.</w:t>
+      </w:r>
+    </w:p>
+    <w:p>
+      <w:pPr>
+        <w:pStyle w:val="Heading3"/>
+      </w:pPr>
+    </w:p>
+    <w:p>
+      <w:pPr>
+        <w:pStyle w:val="Heading3"/>
+      </w:pPr>
+    </w:p>
+    <w:p>
+      <w:pPr>
+        <w:pStyle w:val="Heading3"/>
+      </w:pPr>
+    </w:p>
+    <w:p>
+      <w:pPr>
+        <w:pStyle w:val="Heading3"/>
+      </w:pPr>
+    </w:p>
+    <w:p>
+      <w:pPr>
+        <w:pStyle w:val="Heading3"/>
+      </w:pPr>
+    </w:p>
+    <w:p>
+      <w:pPr>
+        <w:pStyle w:val="Heading3"/>
+      </w:pPr>
+    </w:p>
+    <w:p>
+      <w:pPr>
+        <w:pStyle w:val="Heading3"/>
+      </w:pPr>
+    </w:p>
+    <w:p>
+      <w:pPr>
+        <w:pStyle w:val="Heading3"/>
+      </w:pPr>
+    </w:p>
+    <w:p>
+      <w:pPr>
+        <w:pStyle w:val="Heading3"/>
+      </w:pPr>
+    </w:p>
+    <w:p>
+      <w:pPr>
+        <w:pStyle w:val="Heading3"/>
+      </w:pPr>
+    </w:p>
+    <w:p>
+      <w:pPr>
+        <w:pStyle w:val="Heading3"/>
+      </w:pPr>
+      <w:r>
+        <w:t>Compression Strategies</w:t>
+      </w:r>
+    </w:p>
+    <w:p>
+      <w:pPr>
+        <w:spacing w:before="120" w:after="60"/>
+      </w:pPr>
+      <w:r>
+        <w:rPr>
+          <w:b/>
+          <w:color w:val="1E4078"/>
+        </w:rPr>
+        <w:t>Table: Contextual Compression Strategies</w:t>
+      </w:r>
+    </w:p>
+    <w:tbl>
+      <w:tblPr>
+        <w:tblW w:w="10080" w:type="dxa"/>
+        <w:tblBorders>
+          <w:top w:val="single" w:sz="2" w:space="0" w:color="CCCCCC"/>
+          <w:left w:val="single" w:sz="2" w:space="0" w:color="CCCCCC"/>
+          <w:bottom w:val="single" w:sz="2" w:space="0" w:color="CCCCCC"/>
+          <w:right w:val="single" w:sz="2" w:space="0" w:color="CCCCCC"/>
+          <w:insideH w:val="single" w:sz="2" w:space="0" w:color="CCCCCC"/>
+          <w:insideV w:val="single" w:sz="2" w:space="0" w:color="CCCCCC"/>
+        </w:tblBorders>
+        <w:tblCellMar>
+          <w:top w:w="80" w:type="dxa"/>
+          <w:left w:w="120" w:type="dxa"/>
+          <w:bottom w:w="80" w:type="dxa"/>
+          <w:right w:w="120" w:type="dxa"/>
+        </w:tblCellMar>
+        <w:tblLook w:val="04A0" w:firstRow="1" w:lastRow="0" w:firstColumn="1" w:lastColumn="0" w:noHBand="0" w:noVBand="1"/>
+      </w:tblPr>
+      <w:tblGrid>
+        <w:gridCol w:w="2400"/>
+        <w:gridCol w:w="4000"/>
+        <w:gridCol w:w="3680"/>
+      </w:tblGrid>
+      <w:tr>
+        <w:tc>
+          <w:tcPr>
+            <w:tcW w:w="2400" w:type="dxa"/>
+            <w:tcBorders>
+              <w:top w:val="single" w:sz="2" w:space="0" w:color="CCCCCC"/>
+              <w:left w:val="single" w:sz="2" w:space="0" w:color="CCCCCC"/>
+              <w:bottom w:val="single" w:sz="2" w:space="0" w:color="CCCCCC"/>
+              <w:right w:val="single" w:sz="2" w:space="0" w:color="CCCCCC"/>
+            </w:tcBorders>
+            <w:shd w:val="clear" w:color="auto" w:fill="1E4078"/>
+            <w:tcMar>
+              <w:top w:w="80" w:type="dxa"/>
+              <w:left w:w="120" w:type="dxa"/>
+              <w:bottom w:w="80" w:type="dxa"/>
+              <w:right w:w="120" w:type="dxa"/>
+            </w:tcMar>
+          </w:tcPr>
+          <w:p>
+            <w:r>
+              <w:rPr>
+                <w:b/>
+                <w:color w:val="FFFFFF"/>
+              </w:rPr>
+              <w:t>Strategy</w:t>
+            </w:r>
+          </w:p>
+        </w:tc>
+        <w:tc>
+          <w:tcPr>
+            <w:tcW w:w="4000" w:type="dxa"/>
+            <w:tcBorders>
+              <w:top w:val="single" w:sz="2" w:space="0" w:color="CCCCCC"/>
+              <w:left w:val="single" w:sz="2" w:space="0" w:color="CCCCCC"/>
+              <w:bottom w:val="single" w:sz="2" w:space="0" w:color="CCCCCC"/>
+              <w:right w:val="single" w:sz="2" w:space="0" w:color="CCCCCC"/>
+            </w:tcBorders>
+            <w:shd w:val="clear" w:color="auto" w:fill="1E4078"/>
+            <w:tcMar>
+              <w:top w:w="80" w:type="dxa"/>
+              <w:left w:w="120" w:type="dxa"/>
+              <w:bottom w:w="80" w:type="dxa"/>
+              <w:right w:w="120" w:type="dxa"/>
+            </w:tcMar>
+          </w:tcPr>
+          <w:p>
+            <w:r>
+              <w:rPr>
+                <w:b/>
+                <w:color w:val="FFFFFF"/>
+              </w:rPr>
+              <w:t>Mechanism</w:t>
+            </w:r>
+          </w:p>
+        </w:tc>
+        <w:tc>
+          <w:tcPr>
+            <w:tcW w:w="3680" w:type="dxa"/>
+            <w:tcBorders>
+              <w:top w:val="single" w:sz="2" w:space="0" w:color="CCCCCC"/>
+              <w:left w:val="single" w:sz="2" w:space="0" w:color="CCCCCC"/>
+              <w:bottom w:val="single" w:sz="2" w:space="0" w:color="CCCCCC"/>
+              <w:right w:val="single" w:sz="2" w:space="0" w:color="CCCCCC"/>
+            </w:tcBorders>
+            <w:shd w:val="clear" w:color="auto" w:fill="1E4078"/>
+            <w:tcMar>
+              <w:top w:w="80" w:type="dxa"/>
+              <w:left w:w="120" w:type="dxa"/>
+              <w:bottom w:w="80" w:type="dxa"/>
+              <w:right w:w="120" w:type="dxa"/>
+            </w:tcMar>
+          </w:tcPr>
+          <w:p>
+            <w:r>
+              <w:rPr>
+                <w:b/>
+                <w:color w:val="FFFFFF"/>
+              </w:rPr>
+              <w:t>Trade-off</w:t>
+            </w:r>
+          </w:p>
+        </w:tc>
+      </w:tr>
+      <w:tr>
+        <w:tc>
+          <w:tcPr>
+            <w:tcW w:w="2400" w:type="dxa"/>
+            <w:tcBorders>
+              <w:top w:val="single" w:sz="2" w:space="0" w:color="CCCCCC"/>
+              <w:left w:val="single" w:sz="2" w:space="0" w:color="CCCCCC"/>
+              <w:bottom w:val="single" w:sz="2" w:space="0" w:color="CCCCCC"/>
+              <w:right w:val="single" w:sz="2" w:space="0" w:color="CCCCCC"/>
+            </w:tcBorders>
+            <w:shd w:val="clear" w:color="auto" w:fill="FFFFFF"/>
+            <w:tcMar>
+              <w:top w:w="80" w:type="dxa"/>
+              <w:left w:w="120" w:type="dxa"/>
+              <w:bottom w:w="80" w:type="dxa"/>
+              <w:right w:w="120" w:type="dxa"/>
+            </w:tcMar>
+          </w:tcPr>
+          <w:p>
+            <w:r>
+              <w:t>LLM Chain Extractor</w:t>
+            </w:r>
+          </w:p>
+        </w:tc>
+        <w:tc>
+          <w:tcPr>
+            <w:tcW w:w="4000" w:type="dxa"/>
+            <w:tcBorders>
+              <w:top w:val="single" w:sz="2" w:space="0" w:color="CCCCCC"/>
+              <w:left w:val="single" w:sz="2" w:space="0" w:color="CCCCCC"/>
+              <w:bottom w:val="single" w:sz="2" w:space="0" w:color="CCCCCC"/>
+              <w:right w:val="single" w:sz="2" w:space="0" w:color="CCCCCC"/>
+            </w:tcBorders>
+            <w:shd w:val="clear" w:color="auto" w:fill="FFFFFF"/>
+            <w:tcMar>
+              <w:top w:w="80" w:type="dxa"/>
+              <w:left w:w="120" w:type="dxa"/>
+              <w:bottom w:w="80" w:type="dxa"/>
+              <w:right w:w="120" w:type="dxa"/>
+            </w:tcMar>
+          </w:tcPr>
+          <w:p>
+            <w:r>
+              <w:t>Pass retrieved chunk + query to a small LLM; ask it to extract only the relevant sentences.</w:t>
+            </w:r>
+          </w:p>
+        </w:tc>
+        <w:tc>
+          <w:tcPr>
+            <w:tcW w:w="3680" w:type="dxa"/>
+            <w:tcBorders>
+              <w:top w:val="single" w:sz="2" w:space="0" w:color="CCCCCC"/>
+              <w:left w:val="single" w:sz="2" w:space="0" w:color="CCCCCC"/>
+              <w:bottom w:val="single" w:sz="2" w:space="0" w:color="CCCCCC"/>
+              <w:right w:val="single" w:sz="2" w:space="0" w:color="CCCCCC"/>
+            </w:tcBorders>
+            <w:shd w:val="clear" w:color="auto" w:fill="FFFFFF"/>
+            <w:tcMar>
+              <w:top w:w="80" w:type="dxa"/>
+              <w:left w:w="120" w:type="dxa"/>
+              <w:bottom w:w="80" w:type="dxa"/>
+              <w:right w:w="120" w:type="dxa"/>
+            </w:tcMar>
+          </w:tcPr>
+          <w:p>
+            <w:r>
+              <w:t>High quality; adds one LLM call per chunk retrieved.</w:t>
+            </w:r>
+          </w:p>
+        </w:tc>
+      </w:tr>
+      <w:tr>
+        <w:tc>
+          <w:tcPr>
+            <w:tcW w:w="2400" w:type="dxa"/>
+            <w:tcBorders>
+              <w:top w:val="single" w:sz="2" w:space="0" w:color="CCCCCC"/>
+              <w:left w:val="single" w:sz="2" w:space="0" w:color="CCCCCC"/>
+              <w:bottom w:val="single" w:sz="2" w:space="0" w:color="CCCCCC"/>
+              <w:right w:val="single" w:sz="2" w:space="0" w:color="CCCCCC"/>
+            </w:tcBorders>
+            <w:shd w:val="clear" w:color="auto" w:fill="F3F4F6"/>
+            <w:tcMar>
+              <w:top w:w="80" w:type="dxa"/>
+              <w:left w:w="120" w:type="dxa"/>
+              <w:bottom w:w="80" w:type="dxa"/>
+              <w:right w:w="120" w:type="dxa"/>
+            </w:tcMar>
+          </w:tcPr>
+          <w:p>
+            <w:r>
+              <w:t>LLM Chain Filter</w:t>
+            </w:r>
+          </w:p>
+        </w:tc>
+        <w:tc>
+          <w:tcPr>
+            <w:tcW w:w="4000" w:type="dxa"/>
+            <w:tcBorders>
+              <w:top w:val="single" w:sz="2" w:space="0" w:color="CCCCCC"/>
+              <w:left w:val="single" w:sz="2" w:space="0" w:color="CCCCCC"/>
+              <w:bottom w:val="single" w:sz="2" w:space="0" w:color="CCCCCC"/>
+              <w:right w:val="single" w:sz="2" w:space="0" w:color="CCCCCC"/>
+            </w:tcBorders>
+            <w:shd w:val="clear" w:color="auto" w:fill="F3F4F6"/>
+            <w:tcMar>
+              <w:top w:w="80" w:type="dxa"/>
+              <w:left w:w="120" w:type="dxa"/>
+              <w:bottom w:w="80" w:type="dxa"/>
+              <w:right w:w="120" w:type="dxa"/>
+            </w:tcMar>
+          </w:tcPr>
+          <w:p>
+            <w:r>
+              <w:t>Pass chunk + query to LLM; return the full chunk or discard it entirely based on a relevance judgment.</w:t>
+            </w:r>
+          </w:p>
+        </w:tc>
+        <w:tc>
+          <w:tcPr>
+            <w:tcW w:w="3680" w:type="dxa"/>
+            <w:tcBorders>
+              <w:top w:val="single" w:sz="2" w:space="0" w:color="CCCCCC"/>
+              <w:left w:val="single" w:sz="2" w:space="0" w:color="CCCCCC"/>
+              <w:bottom w:val="single" w:sz="2" w:space="0" w:color="CCCCCC"/>
+              <w:right w:val="single" w:sz="2" w:space="0" w:color="CCCCCC"/>
+            </w:tcBorders>
+            <w:shd w:val="clear" w:color="auto" w:fill="F3F4F6"/>
+            <w:tcMar>
+              <w:top w:w="80" w:type="dxa"/>
+              <w:left w:w="120" w:type="dxa"/>
+              <w:bottom w:w="80" w:type="dxa"/>
+              <w:right w:w="120" w:type="dxa"/>
+            </w:tcMar>
+          </w:tcPr>
+          <w:p>
+            <w:r>
+              <w:t>Binary — no partial extraction; faster than extractor.</w:t>
+            </w:r>
+          </w:p>
+        </w:tc>
+      </w:tr>
+      <w:tr>
+        <w:tc>
+          <w:tcPr>
+            <w:tcW w:w="2400" w:type="dxa"/>
+            <w:tcBorders>
+              <w:top w:val="single" w:sz="2" w:space="0" w:color="CCCCCC"/>
+              <w:left w:val="single" w:sz="2" w:space="0" w:color="CCCCCC"/>
+              <w:bottom w:val="single" w:sz="2" w:space="0" w:color="CCCCCC"/>
+              <w:right w:val="single" w:sz="2" w:space="0" w:color="CCCCCC"/>
+            </w:tcBorders>
+            <w:shd w:val="clear" w:color="auto" w:fill="FFFFFF"/>
+            <w:tcMar>
+              <w:top w:w="80" w:type="dxa"/>
+              <w:left w:w="120" w:type="dxa"/>
+              <w:bottom w:w="80" w:type="dxa"/>
+              <w:right w:w="120" w:type="dxa"/>
+            </w:tcMar>
+          </w:tcPr>
+          <w:p>
+            <w:r>
+              <w:t>Embeddings Filter</w:t>
+            </w:r>
+          </w:p>
+        </w:tc>
+        <w:tc>
+          <w:tcPr>
+            <w:tcW w:w="4000" w:type="dxa"/>
+            <w:tcBorders>
+              <w:top w:val="single" w:sz="2" w:space="0" w:color="CCCCCC"/>
+              <w:left w:val="single" w:sz="2" w:space="0" w:color="CCCCCC"/>
+              <w:bottom w:val="single" w:sz="2" w:space="0" w:color="CCCCCC"/>
+              <w:right w:val="single" w:sz="2" w:space="0" w:color="CCCCCC"/>
+            </w:tcBorders>
+            <w:shd w:val="clear" w:color="auto" w:fill="FFFFFF"/>
+            <w:tcMar>
+              <w:top w:w="80" w:type="dxa"/>
+              <w:left w:w="120" w:type="dxa"/>
+              <w:bottom w:w="80" w:type="dxa"/>
+              <w:right w:w="120" w:type="dxa"/>
+            </w:tcMar>
+          </w:tcPr>
+          <w:p>
+            <w:r>
+              <w:t>Compute cosine similarity between each sentence embedding and the query embedding; retain sentences above a threshold.</w:t>
+            </w:r>
+          </w:p>
+        </w:tc>
+        <w:tc>
+          <w:tcPr>
+            <w:tcW w:w="3680" w:type="dxa"/>
+            <w:tcBorders>
+              <w:top w:val="single" w:sz="2" w:space="0" w:color="CCCCCC"/>
+              <w:left w:val="single" w:sz="2" w:space="0" w:color="CCCCCC"/>
+              <w:bottom w:val="single" w:sz="2" w:space="0" w:color="CCCCCC"/>
+              <w:right w:val="single" w:sz="2" w:space="0" w:color="CCCCCC"/>
+            </w:tcBorders>
+            <w:shd w:val="clear" w:color="auto" w:fill="FFFFFF"/>
+            <w:tcMar>
+              <w:top w:w="80" w:type="dxa"/>
+              <w:left w:w="120" w:type="dxa"/>
+              <w:bottom w:w="80" w:type="dxa"/>
+              <w:right w:w="120" w:type="dxa"/>
+            </w:tcMar>
+          </w:tcPr>
+          <w:p>
+            <w:r>
+              <w:t>No LLM call; sentence granularity; threshold tuning required.</w:t>
+            </w:r>
+          </w:p>
+        </w:tc>
+      </w:tr>
+      <w:tr>
+        <w:tc>
+          <w:tcPr>
+            <w:tcW w:w="2400" w:type="dxa"/>
+            <w:tcBorders>
+              <w:top w:val="single" w:sz="2" w:space="0" w:color="CCCCCC"/>
+              <w:left w:val="single" w:sz="2" w:space="0" w:color="CCCCCC"/>
+              <w:bottom w:val="single" w:sz="2" w:space="0" w:color="CCCCCC"/>
+              <w:right w:val="single" w:sz="2" w:space="0" w:color="CCCCCC"/>
+            </w:tcBorders>
+            <w:shd w:val="clear" w:color="auto" w:fill="F3F4F6"/>
+            <w:tcMar>
+              <w:top w:w="80" w:type="dxa"/>
+              <w:left w:w="120" w:type="dxa"/>
+              <w:bottom w:w="80" w:type="dxa"/>
+              <w:right w:w="120" w:type="dxa"/>
+            </w:tcMar>
+          </w:tcPr>
+          <w:p>
+            <w:r>
+              <w:t>RECOMP (Xu et al., 2024)</w:t>
+            </w:r>
+          </w:p>
+        </w:tc>
+        <w:tc>
+          <w:tcPr>
+            <w:tcW w:w="4000" w:type="dxa"/>
+            <w:tcBorders>
+              <w:top w:val="single" w:sz="2" w:space="0" w:color="CCCCCC"/>
+              <w:left w:val="single" w:sz="2" w:space="0" w:color="CCCCCC"/>
+              <w:bottom w:val="single" w:sz="2" w:space="0" w:color="CCCCCC"/>
+              <w:right w:val="single" w:sz="2" w:space="0" w:color="CCCCCC"/>
+            </w:tcBorders>
+            <w:shd w:val="clear" w:color="auto" w:fill="F3F4F6"/>
+            <w:tcMar>
+              <w:top w:w="80" w:type="dxa"/>
+              <w:left w:w="120" w:type="dxa"/>
+              <w:bottom w:w="80" w:type="dxa"/>
+              <w:right w:w="120" w:type="dxa"/>
+            </w:tcMar>
+          </w:tcPr>
+          <w:p>
+            <w:r>
+              <w:t>Fine-tuned compressor generates an abstractive summary of retrieved evidence conditioned on the query.</w:t>
+            </w:r>
+          </w:p>
+        </w:tc>
+        <w:tc>
+          <w:tcPr>
+            <w:tcW w:w="3680" w:type="dxa"/>
+            <w:tcBorders>
+              <w:top w:val="single" w:sz="2" w:space="0" w:color="CCCCCC"/>
+              <w:left w:val="single" w:sz="2" w:space="0" w:color="CCCCCC"/>
+              <w:bottom w:val="single" w:sz="2" w:space="0" w:color="CCCCCC"/>
+              <w:right w:val="single" w:sz="2" w:space="0" w:color="CCCCCC"/>
+            </w:tcBorders>
+            <w:shd w:val="clear" w:color="auto" w:fill="F3F4F6"/>
+            <w:tcMar>
+              <w:top w:w="80" w:type="dxa"/>
+              <w:left w:w="120" w:type="dxa"/>
+              <w:bottom w:w="80" w:type="dxa"/>
+              <w:right w:w="120" w:type="dxa"/>
+            </w:tcMar>
+          </w:tcPr>
+          <w:p>
+            <w:r>
+              <w:t>Best compression quality; requires a fine-tuned model.</w:t>
+            </w:r>
+          </w:p>
+        </w:tc>
+      </w:tr>
+      <w:tr>
+        <w:tc>
+          <w:tcPr>
+            <w:tcW w:w="2400" w:type="dxa"/>
+            <w:tcBorders>
+              <w:top w:val="single" w:sz="2" w:space="0" w:color="CCCCCC"/>
+              <w:left w:val="single" w:sz="2" w:space="0" w:color="CCCCCC"/>
+              <w:bottom w:val="single" w:sz="2" w:space="0" w:color="CCCCCC"/>
+              <w:right w:val="single" w:sz="2" w:space="0" w:color="CCCCCC"/>
+            </w:tcBorders>
+            <w:shd w:val="clear" w:color="auto" w:fill="FFFFFF"/>
+            <w:tcMar>
+              <w:top w:w="80" w:type="dxa"/>
+              <w:left w:w="120" w:type="dxa"/>
+              <w:bottom w:w="80" w:type="dxa"/>
+              <w:right w:w="120" w:type="dxa"/>
+            </w:tcMar>
+          </w:tcPr>
+          <w:p>
+            <w:r>
+              <w:t>EXIT (Hwang et al., 2024)</w:t>
+            </w:r>
+          </w:p>
+        </w:tc>
+        <w:tc>
+          <w:tcPr>
+            <w:tcW w:w="4000" w:type="dxa"/>
+            <w:tcBorders>
+              <w:top w:val="single" w:sz="2" w:space="0" w:color="CCCCCC"/>
+              <w:left w:val="single" w:sz="2" w:space="0" w:color="CCCCCC"/>
+              <w:bottom w:val="single" w:sz="2" w:space="0" w:color="CCCCCC"/>
+              <w:right w:val="single" w:sz="2" w:space="0" w:color="CCCCCC"/>
+            </w:tcBorders>
+            <w:shd w:val="clear" w:color="auto" w:fill="FFFFFF"/>
+            <w:tcMar>
+              <w:top w:w="80" w:type="dxa"/>
+              <w:left w:w="120" w:type="dxa"/>
+              <w:bottom w:w="80" w:type="dxa"/>
+              <w:right w:w="120" w:type="dxa"/>
+            </w:tcMar>
+          </w:tcPr>
+          <w:p>
+            <w:r>
+              <w:t>Extractive compression framework; selects spans context-aware to the full query.</w:t>
+            </w:r>
+          </w:p>
+        </w:tc>
+        <w:tc>
+          <w:tcPr>
+            <w:tcW w:w="3680" w:type="dxa"/>
+            <w:tcBorders>
+              <w:top w:val="single" w:sz="2" w:space="0" w:color="CCCCCC"/>
+              <w:left w:val="single" w:sz="2" w:space="0" w:color="CCCCCC"/>
+              <w:bottom w:val="single" w:sz="2" w:space="0" w:color="CCCCCC"/>
+              <w:right w:val="single" w:sz="2" w:space="0" w:color="CCCCCC"/>
+            </w:tcBorders>
+            <w:shd w:val="clear" w:color="auto" w:fill="FFFFFF"/>
+            <w:tcMar>
+              <w:top w:w="80" w:type="dxa"/>
+              <w:left w:w="120" w:type="dxa"/>
+              <w:bottom w:w="80" w:type="dxa"/>
+              <w:right w:w="120" w:type="dxa"/>
+            </w:tcMar>
+          </w:tcPr>
+          <w:p>
+            <w:r>
+              <w:t>State-of-art extractive; open-source; no fine-tuning needed.</w:t>
+            </w:r>
+          </w:p>
+        </w:tc>
+      </w:tr>
+    </w:tbl>
+    <w:p>
+      <w:pPr>
+        <w:spacing w:after="100"/>
+      </w:pPr>
+    </w:p>
+    <w:p>
+      <w:pPr>
+        <w:pStyle w:val="Heading3"/>
+      </w:pPr>
+      <w:r>
+        <w:t>Relevance to This Solution</w:t>
+      </w:r>
+    </w:p>
+    <w:p>
+      <w:pPr>
+        <w:spacing w:after="140"/>
+      </w:pPr>
+      <w:r>
+        <w:t>The current system passes full enriched chunks (which include summary, keywords, and passage body) to the LLM. The format_retrieved_context() function assembles numbered blocks containing source, author, passage type, concepts, and excerpt — already a lightweight form of manual compression. True contextual compression (LLM-based sentence extraction) is a Phase 5 roadmap item that would reduce token consumption per query and allow a larger effective top-K without exceeding the context window.</w:t>
+      </w:r>
+    </w:p>
+    <w:tbl>
+      <w:tblPr>
+        <w:tblW w:w="10080" w:type="dxa"/>
+        <w:tblBorders>
+          <w:top w:val="single" w:sz="4" w:space="0" w:color="6E3CA0"/>
+          <w:left w:val="single" w:sz="4" w:space="0" w:color="6E3CA0"/>
+          <w:bottom w:val="single" w:sz="4" w:space="0" w:color="6E3CA0"/>
+          <w:right w:val="single" w:sz="4" w:space="0" w:color="6E3CA0"/>
+        </w:tblBorders>
+        <w:tblLook w:val="04A0" w:firstRow="1" w:lastRow="0" w:firstColumn="1" w:lastColumn="0" w:noHBand="0" w:noVBand="1"/>
+      </w:tblPr>
+      <w:tblGrid>
+        <w:gridCol w:w="10080"/>
+      </w:tblGrid>
+      <w:tr>
+        <w:tc>
+          <w:tcPr>
+            <w:tcW w:w="10080" w:type="dxa"/>
+            <w:shd w:val="clear" w:color="auto" w:fill="EAD5F8"/>
+            <w:tcMar>
+              <w:top w:w="100" w:type="dxa"/>
+              <w:left w:w="160" w:type="dxa"/>
+              <w:bottom w:w="100" w:type="dxa"/>
+              <w:right w:w="160" w:type="dxa"/>
+            </w:tcMar>
+          </w:tcPr>
+          <w:p>
+            <w:pPr>
+              <w:spacing w:after="80"/>
+            </w:pPr>
+            <w:r>
+              <w:rPr>
+                <w:b/>
+                <w:color w:val="6E3CA0"/>
+              </w:rPr>
+              <w:t>Contextual Compression — Key Properties</w:t>
+            </w:r>
+          </w:p>
+          <w:p>
+            <w:pPr>
+              <w:numPr>
+                <w:ilvl w:val="0"/>
+                <w:numId w:val="1"/>
+              </w:numPr>
+              <w:spacing w:after="60"/>
+            </w:pPr>
+            <w:r>
+              <w:rPr>
+                <w:sz w:val="20"/>
+              </w:rPr>
+              <w:t>Reduces LLM inference cost and context noise without discarding retrieved chunks entirely.</w:t>
+            </w:r>
+          </w:p>
+          <w:p>
+            <w:pPr>
+              <w:numPr>
+                <w:ilvl w:val="0"/>
+                <w:numId w:val="1"/>
+              </w:numPr>
+              <w:spacing w:after="60"/>
+            </w:pPr>
+            <w:r>
+              <w:rPr>
+                <w:sz w:val="20"/>
+              </w:rPr>
+              <w:t>LLMChainExtractor (LangChain) reduces context tokens by 40–65% while retaining 92–96% of full-context answer accuracy (LangChain case study, 2026).</w:t>
+            </w:r>
+          </w:p>
+          <w:p>
+            <w:pPr>
+              <w:numPr>
+                <w:ilvl w:val="0"/>
+                <w:numId w:val="1"/>
+              </w:numPr>
+              <w:spacing w:after="60"/>
+            </w:pPr>
+            <w:r>
+              <w:rPr>
+                <w:sz w:val="20"/>
+              </w:rPr>
+              <w:t>Extractive methods (embeddings filter, EXIT) require no extra LLM call; abstractive methods (RECOMP) produce the tightest output but require a fine-tuned model.</w:t>
+            </w:r>
+          </w:p>
+          <w:p>
+            <w:pPr>
+              <w:numPr>
+                <w:ilvl w:val="0"/>
+                <w:numId w:val="1"/>
+              </w:numPr>
+              <w:spacing w:after="60"/>
+            </w:pPr>
+            <w:r>
+              <w:rPr>
+                <w:sz w:val="20"/>
+              </w:rPr>
+              <w:t>Most valuable when top-K &gt; 5: without compression, 8–10 full chunks can saturate the prompt and degrade response coherence.</w:t>
+            </w:r>
+          </w:p>
+          <w:p>
+            <w:pPr>
+              <w:numPr>
+                <w:ilvl w:val="0"/>
+                <w:numId w:val="1"/>
+              </w:numPr>
+              <w:spacing w:after="60"/>
+            </w:pPr>
+            <w:r>
+              <w:rPr>
+                <w:sz w:val="20"/>
+              </w:rPr>
+              <w:t>Particularly beneficial in this solution for passages with long preambles (book introductions, methodology sections) where only 2–3 sentences are actually query-relevant.</w:t>
+            </w:r>
+          </w:p>
+        </w:tc>
+      </w:tr>
+    </w:tbl>
+    <w:p>
+      <w:pPr>
+        <w:spacing w:after="200"/>
+      </w:pPr>
+    </w:p>
+    <w:p>
+      <w:pPr>
+        <w:spacing w:after="200"/>
+      </w:pPr>
+    </w:p>
+    <w:p>
+      <w:pPr>
+        <w:spacing w:after="200"/>
+      </w:pPr>
+    </w:p>
+    <w:p>
+      <w:pPr>
+        <w:spacing w:after="200"/>
+      </w:pPr>
+    </w:p>
+    <w:p>
+      <w:pPr>
+        <w:pStyle w:val="Heading2"/>
+      </w:pPr>
+      <w:r>
+        <w:t>4. Ensemble Retrieval (Hybrid Search)</w:t>
+      </w:r>
+    </w:p>
+    <w:p>
+      <w:pPr>
+        <w:spacing w:after="140"/>
+      </w:pPr>
+      <w:r>
+        <w:t>No single retrieval strategy excels across all query types. Dense vector search captures semantic paraphrase and concept proximity but can miss exact-term matches — product codes, legal clause numbers, proper nouns, or specific author names. BM25 lexical search excels at exact-term anchoring but fails on conceptually related queries that share no vocabulary. Ensemble retrieval (also called hybrid search) combines both to recover the strengths of each.</w:t>
+      </w:r>
+    </w:p>
+    <w:p>
+      <w:pPr>
+        <w:spacing w:after="140"/>
+      </w:pPr>
+      <w:r>
+        <w:t>Research support: Hybrid BM25 + dense retrieval with Reciprocal Rank Fusion (RRF) consistently improves recall by 15–30% over single-method retrieval in benchmarked RAG pipelines (arXiv:2604.01733, 2025). A production study across 23,088 queries found that Hybrid RRF with cross-encoder reranking dominated all other retrieval methods tested, including pure vector, pure BM25, and contextual hybrid variants.</w:t>
+      </w:r>
+    </w:p>
+    <w:p>
+      <w:pPr>
+        <w:pStyle w:val="Heading3"/>
+      </w:pPr>
+      <w:r>
+        <w:t>How Ensemble Retrieval Works</w:t>
+      </w:r>
+    </w:p>
+    <w:p>
+      <w:pPr>
+        <w:spacing w:after="80"/>
+      </w:pPr>
+      <w:r>
+        <w:t>The standard pattern runs two retrievers in parallel against the same query:</w:t>
+      </w:r>
+    </w:p>
+    <w:p>
+      <w:pPr>
+        <w:numPr>
+          <w:ilvl w:val="0"/>
+          <w:numId w:val="1"/>
+        </w:numPr>
+        <w:spacing w:after="80"/>
+      </w:pPr>
+      <w:r>
+        <w:t>Dense retriever — embeds the query using the same model used at index time (Titan v2 in this solution) and performs FAISS similarity search. Returns top-N by cosine similarity.</w:t>
+      </w:r>
+    </w:p>
+    <w:p>
+      <w:pPr>
+        <w:numPr>
+          <w:ilvl w:val="0"/>
+          <w:numId w:val="1"/>
+        </w:numPr>
+        <w:spacing w:after="80"/>
+      </w:pPr>
+      <w:r>
+        <w:t>Sparse retriever (BM25) — tokenises the query and scores documents by term frequency and inverse document frequency. Returns top-N by BM25 score.</w:t>
+      </w:r>
+    </w:p>
+    <w:p>
+      <w:pPr>
+        <w:numPr>
+          <w:ilvl w:val="0"/>
+          <w:numId w:val="1"/>
+        </w:numPr>
+        <w:spacing w:after="80"/>
+      </w:pPr>
+      <w:r>
+        <w:t>Fusion — combines the two ranked lists. Reciprocal Rank Fusion (RRF) is the standard method: each document is scored as the sum of 1/(k + rank_i) across retrievers, where k is a smoothing constant (typically 60). RRF is scale-agnostic: it ignores raw scores and works on ranks only, avoiding the problem of incompatible score distributions.</w:t>
+      </w:r>
+    </w:p>
+    <w:p>
+      <w:pPr>
+        <w:numPr>
+          <w:ilvl w:val="0"/>
+          <w:numId w:val="1"/>
+        </w:numPr>
+        <w:spacing w:after="80"/>
+      </w:pPr>
+      <w:r>
+        <w:t xml:space="preserve">Reranker (optional) — a cross-encoder model re-scores the merged </w:t>
+      </w:r>
+      <w:proofErr w:type="gramStart"/>
+      <w:r>
+        <w:t>top-M</w:t>
+      </w:r>
+      <w:proofErr w:type="gramEnd"/>
+      <w:r>
+        <w:t xml:space="preserve"> candidates based on full query-document interaction before final </w:t>
+      </w:r>
+      <w:proofErr w:type="gramStart"/>
+      <w:r>
+        <w:t>top-K</w:t>
+      </w:r>
+      <w:proofErr w:type="gramEnd"/>
+      <w:r>
+        <w:t xml:space="preserve"> selection.</w:t>
+      </w:r>
+    </w:p>
+    <w:p>
+      <w:pPr>
+        <w:pStyle w:val="Heading3"/>
+      </w:pPr>
+      <w:r>
+        <w:t>Fusion Strategy Comparison</w:t>
+      </w:r>
+    </w:p>
+    <w:p>
+      <w:pPr>
+        <w:spacing w:before="120" w:after="60"/>
+      </w:pPr>
+      <w:r>
+        <w:rPr>
+          <w:b/>
+          <w:color w:val="1E4078"/>
+        </w:rPr>
+        <w:t>Table: Fusion Strategy Comparison</w:t>
+      </w:r>
+    </w:p>
+    <w:tbl>
+      <w:tblPr>
+        <w:tblW w:w="10080" w:type="dxa"/>
+        <w:tblBorders>
+          <w:top w:val="single" w:sz="2" w:space="0" w:color="CCCCCC"/>
+          <w:left w:val="single" w:sz="2" w:space="0" w:color="CCCCCC"/>
+          <w:bottom w:val="single" w:sz="2" w:space="0" w:color="CCCCCC"/>
+          <w:right w:val="single" w:sz="2" w:space="0" w:color="CCCCCC"/>
+          <w:insideH w:val="single" w:sz="2" w:space="0" w:color="CCCCCC"/>
+          <w:insideV w:val="single" w:sz="2" w:space="0" w:color="CCCCCC"/>
+        </w:tblBorders>
+        <w:tblCellMar>
+          <w:top w:w="80" w:type="dxa"/>
+          <w:left w:w="120" w:type="dxa"/>
+          <w:bottom w:w="80" w:type="dxa"/>
+          <w:right w:w="120" w:type="dxa"/>
+        </w:tblCellMar>
+        <w:tblLook w:val="04A0" w:firstRow="1" w:lastRow="0" w:firstColumn="1" w:lastColumn="0" w:noHBand="0" w:noVBand="1"/>
+      </w:tblPr>
+      <w:tblGrid>
+        <w:gridCol w:w="2691"/>
+        <w:gridCol w:w="3402"/>
+        <w:gridCol w:w="3987"/>
+      </w:tblGrid>
+      <w:tr>
+        <w:tc>
+          <w:tcPr>
+            <w:tcW w:w="2691" w:type="dxa"/>
+            <w:tcBorders>
+              <w:top w:val="single" w:sz="2" w:space="0" w:color="CCCCCC"/>
+              <w:left w:val="single" w:sz="2" w:space="0" w:color="CCCCCC"/>
+              <w:bottom w:val="single" w:sz="2" w:space="0" w:color="CCCCCC"/>
+              <w:right w:val="single" w:sz="2" w:space="0" w:color="CCCCCC"/>
+            </w:tcBorders>
+            <w:shd w:val="clear" w:color="auto" w:fill="1E4078"/>
+            <w:tcMar>
+              <w:top w:w="80" w:type="dxa"/>
+              <w:left w:w="120" w:type="dxa"/>
+              <w:bottom w:w="80" w:type="dxa"/>
+              <w:right w:w="120" w:type="dxa"/>
+            </w:tcMar>
+          </w:tcPr>
+          <w:p>
+            <w:r>
+              <w:rPr>
+                <w:b/>
+                <w:color w:val="FFFFFF"/>
+              </w:rPr>
+              <w:t>Fusion Method</w:t>
+            </w:r>
+          </w:p>
+        </w:tc>
+        <w:tc>
+          <w:tcPr>
+            <w:tcW w:w="3402" w:type="dxa"/>
+            <w:tcBorders>
+              <w:top w:val="single" w:sz="2" w:space="0" w:color="CCCCCC"/>
+              <w:left w:val="single" w:sz="2" w:space="0" w:color="CCCCCC"/>
+              <w:bottom w:val="single" w:sz="2" w:space="0" w:color="CCCCCC"/>
+              <w:right w:val="single" w:sz="2" w:space="0" w:color="CCCCCC"/>
+            </w:tcBorders>
+            <w:shd w:val="clear" w:color="auto" w:fill="1E4078"/>
+            <w:tcMar>
+              <w:top w:w="80" w:type="dxa"/>
+              <w:left w:w="120" w:type="dxa"/>
+              <w:bottom w:w="80" w:type="dxa"/>
+              <w:right w:w="120" w:type="dxa"/>
+            </w:tcMar>
+          </w:tcPr>
+          <w:p>
+            <w:r>
+              <w:rPr>
+                <w:b/>
+                <w:color w:val="FFFFFF"/>
+              </w:rPr>
+              <w:t>Mechanism</w:t>
+            </w:r>
+          </w:p>
+        </w:tc>
+        <w:tc>
+          <w:tcPr>
+            <w:tcW w:w="3987" w:type="dxa"/>
+            <w:tcBorders>
+              <w:top w:val="single" w:sz="2" w:space="0" w:color="CCCCCC"/>
+              <w:left w:val="single" w:sz="2" w:space="0" w:color="CCCCCC"/>
+              <w:bottom w:val="single" w:sz="2" w:space="0" w:color="CCCCCC"/>
+              <w:right w:val="single" w:sz="2" w:space="0" w:color="CCCCCC"/>
+            </w:tcBorders>
+            <w:shd w:val="clear" w:color="auto" w:fill="1E4078"/>
+            <w:tcMar>
+              <w:top w:w="80" w:type="dxa"/>
+              <w:left w:w="120" w:type="dxa"/>
+              <w:bottom w:w="80" w:type="dxa"/>
+              <w:right w:w="120" w:type="dxa"/>
+            </w:tcMar>
+          </w:tcPr>
+          <w:p>
+            <w:r>
+              <w:rPr>
+                <w:b/>
+                <w:color w:val="FFFFFF"/>
+              </w:rPr>
+              <w:t>Best Used When</w:t>
+            </w:r>
+          </w:p>
+        </w:tc>
+      </w:tr>
+      <w:tr>
+        <w:tc>
+          <w:tcPr>
+            <w:tcW w:w="2691" w:type="dxa"/>
+            <w:tcBorders>
+              <w:top w:val="single" w:sz="2" w:space="0" w:color="CCCCCC"/>
+              <w:left w:val="single" w:sz="2" w:space="0" w:color="CCCCCC"/>
+              <w:bottom w:val="single" w:sz="2" w:space="0" w:color="CCCCCC"/>
+              <w:right w:val="single" w:sz="2" w:space="0" w:color="CCCCCC"/>
+            </w:tcBorders>
+            <w:shd w:val="clear" w:color="auto" w:fill="FFFFFF"/>
+            <w:tcMar>
+              <w:top w:w="80" w:type="dxa"/>
+              <w:left w:w="120" w:type="dxa"/>
+              <w:bottom w:w="80" w:type="dxa"/>
+              <w:right w:w="120" w:type="dxa"/>
+            </w:tcMar>
+          </w:tcPr>
+          <w:p>
+            <w:r>
+              <w:t>Reciprocal Rank Fusion (RRF)</w:t>
+            </w:r>
+          </w:p>
+        </w:tc>
+        <w:tc>
+          <w:tcPr>
+            <w:tcW w:w="3402" w:type="dxa"/>
+            <w:tcBorders>
+              <w:top w:val="single" w:sz="2" w:space="0" w:color="CCCCCC"/>
+              <w:left w:val="single" w:sz="2" w:space="0" w:color="CCCCCC"/>
+              <w:bottom w:val="single" w:sz="2" w:space="0" w:color="CCCCCC"/>
+              <w:right w:val="single" w:sz="2" w:space="0" w:color="CCCCCC"/>
+            </w:tcBorders>
+            <w:shd w:val="clear" w:color="auto" w:fill="FFFFFF"/>
+            <w:tcMar>
+              <w:top w:w="80" w:type="dxa"/>
+              <w:left w:w="120" w:type="dxa"/>
+              <w:bottom w:w="80" w:type="dxa"/>
+              <w:right w:w="120" w:type="dxa"/>
+            </w:tcMar>
+          </w:tcPr>
+          <w:p>
+            <w:r>
+              <w:t>Score = Σ 1/(k + rank_i). Scale-agnostic; uses only ranks.</w:t>
+            </w:r>
+          </w:p>
+        </w:tc>
+        <w:tc>
+          <w:tcPr>
+            <w:tcW w:w="3987" w:type="dxa"/>
+            <w:tcBorders>
+              <w:top w:val="single" w:sz="2" w:space="0" w:color="CCCCCC"/>
+              <w:left w:val="single" w:sz="2" w:space="0" w:color="CCCCCC"/>
+              <w:bottom w:val="single" w:sz="2" w:space="0" w:color="CCCCCC"/>
+              <w:right w:val="single" w:sz="2" w:space="0" w:color="CCCCCC"/>
+            </w:tcBorders>
+            <w:shd w:val="clear" w:color="auto" w:fill="FFFFFF"/>
+            <w:tcMar>
+              <w:top w:w="80" w:type="dxa"/>
+              <w:left w:w="120" w:type="dxa"/>
+              <w:bottom w:w="80" w:type="dxa"/>
+              <w:right w:w="120" w:type="dxa"/>
+            </w:tcMar>
+          </w:tcPr>
+          <w:p>
+            <w:r>
+              <w:t>Default choice; scores from different retrievers are on incompatible scales.</w:t>
+            </w:r>
+          </w:p>
+        </w:tc>
+      </w:tr>
+      <w:tr>
+        <w:tc>
+          <w:tcPr>
+            <w:tcW w:w="2691" w:type="dxa"/>
+            <w:tcBorders>
+              <w:top w:val="single" w:sz="2" w:space="0" w:color="CCCCCC"/>
+              <w:left w:val="single" w:sz="2" w:space="0" w:color="CCCCCC"/>
+              <w:bottom w:val="single" w:sz="2" w:space="0" w:color="CCCCCC"/>
+              <w:right w:val="single" w:sz="2" w:space="0" w:color="CCCCCC"/>
+            </w:tcBorders>
+            <w:shd w:val="clear" w:color="auto" w:fill="F3F4F6"/>
+            <w:tcMar>
+              <w:top w:w="80" w:type="dxa"/>
+              <w:left w:w="120" w:type="dxa"/>
+              <w:bottom w:w="80" w:type="dxa"/>
+              <w:right w:w="120" w:type="dxa"/>
+            </w:tcMar>
+          </w:tcPr>
+          <w:p>
+            <w:r>
+              <w:t>Weighted Score Combination</w:t>
+            </w:r>
+          </w:p>
+        </w:tc>
+        <w:tc>
+          <w:tcPr>
+            <w:tcW w:w="3402" w:type="dxa"/>
+            <w:tcBorders>
+              <w:top w:val="single" w:sz="2" w:space="0" w:color="CCCCCC"/>
+              <w:left w:val="single" w:sz="2" w:space="0" w:color="CCCCCC"/>
+              <w:bottom w:val="single" w:sz="2" w:space="0" w:color="CCCCCC"/>
+              <w:right w:val="single" w:sz="2" w:space="0" w:color="CCCCCC"/>
+            </w:tcBorders>
+            <w:shd w:val="clear" w:color="auto" w:fill="F3F4F6"/>
+            <w:tcMar>
+              <w:top w:w="80" w:type="dxa"/>
+              <w:left w:w="120" w:type="dxa"/>
+              <w:bottom w:w="80" w:type="dxa"/>
+              <w:right w:w="120" w:type="dxa"/>
+            </w:tcMar>
+          </w:tcPr>
+          <w:p>
+            <w:r>
+              <w:t>Score = α × dense_score + (1−α) × sparse_score. Direct blend.</w:t>
+            </w:r>
+          </w:p>
+        </w:tc>
+        <w:tc>
+          <w:tcPr>
+            <w:tcW w:w="3987" w:type="dxa"/>
+            <w:tcBorders>
+              <w:top w:val="single" w:sz="2" w:space="0" w:color="CCCCCC"/>
+              <w:left w:val="single" w:sz="2" w:space="0" w:color="CCCCCC"/>
+              <w:bottom w:val="single" w:sz="2" w:space="0" w:color="CCCCCC"/>
+              <w:right w:val="single" w:sz="2" w:space="0" w:color="CCCCCC"/>
+            </w:tcBorders>
+            <w:shd w:val="clear" w:color="auto" w:fill="F3F4F6"/>
+            <w:tcMar>
+              <w:top w:w="80" w:type="dxa"/>
+              <w:left w:w="120" w:type="dxa"/>
+              <w:bottom w:w="80" w:type="dxa"/>
+              <w:right w:w="120" w:type="dxa"/>
+            </w:tcMar>
+          </w:tcPr>
+          <w:p>
+            <w:r>
+              <w:t>Scores have been normalised to the same range; allows asymmetric weighting.</w:t>
+            </w:r>
+          </w:p>
+        </w:tc>
+      </w:tr>
+      <w:tr>
+        <w:tc>
+          <w:tcPr>
+            <w:tcW w:w="2691" w:type="dxa"/>
+            <w:tcBorders>
+              <w:top w:val="single" w:sz="2" w:space="0" w:color="CCCCCC"/>
+              <w:left w:val="single" w:sz="2" w:space="0" w:color="CCCCCC"/>
+              <w:bottom w:val="single" w:sz="2" w:space="0" w:color="CCCCCC"/>
+              <w:right w:val="single" w:sz="2" w:space="0" w:color="CCCCCC"/>
+            </w:tcBorders>
+            <w:shd w:val="clear" w:color="auto" w:fill="FFFFFF"/>
+            <w:tcMar>
+              <w:top w:w="80" w:type="dxa"/>
+              <w:left w:w="120" w:type="dxa"/>
+              <w:bottom w:w="80" w:type="dxa"/>
+              <w:right w:w="120" w:type="dxa"/>
+            </w:tcMar>
+          </w:tcPr>
+          <w:p>
+            <w:r>
+              <w:t>Voting / Majority</w:t>
+            </w:r>
+          </w:p>
+        </w:tc>
+        <w:tc>
+          <w:tcPr>
+            <w:tcW w:w="3402" w:type="dxa"/>
+            <w:tcBorders>
+              <w:top w:val="single" w:sz="2" w:space="0" w:color="CCCCCC"/>
+              <w:left w:val="single" w:sz="2" w:space="0" w:color="CCCCCC"/>
+              <w:bottom w:val="single" w:sz="2" w:space="0" w:color="CCCCCC"/>
+              <w:right w:val="single" w:sz="2" w:space="0" w:color="CCCCCC"/>
+            </w:tcBorders>
+            <w:shd w:val="clear" w:color="auto" w:fill="FFFFFF"/>
+            <w:tcMar>
+              <w:top w:w="80" w:type="dxa"/>
+              <w:left w:w="120" w:type="dxa"/>
+              <w:bottom w:w="80" w:type="dxa"/>
+              <w:right w:w="120" w:type="dxa"/>
+            </w:tcMar>
+          </w:tcPr>
+          <w:p>
+            <w:r>
+              <w:t>Document included if it appears in ≥ N/2 retriever result sets.</w:t>
+            </w:r>
+          </w:p>
+        </w:tc>
+        <w:tc>
+          <w:tcPr>
+            <w:tcW w:w="3987" w:type="dxa"/>
+            <w:tcBorders>
+              <w:top w:val="single" w:sz="2" w:space="0" w:color="CCCCCC"/>
+              <w:left w:val="single" w:sz="2" w:space="0" w:color="CCCCCC"/>
+              <w:bottom w:val="single" w:sz="2" w:space="0" w:color="CCCCCC"/>
+              <w:right w:val="single" w:sz="2" w:space="0" w:color="CCCCCC"/>
+            </w:tcBorders>
+            <w:shd w:val="clear" w:color="auto" w:fill="FFFFFF"/>
+            <w:tcMar>
+              <w:top w:w="80" w:type="dxa"/>
+              <w:left w:w="120" w:type="dxa"/>
+              <w:bottom w:w="80" w:type="dxa"/>
+              <w:right w:w="120" w:type="dxa"/>
+            </w:tcMar>
+          </w:tcPr>
+          <w:p>
+            <w:r>
+              <w:t>Simple ensemble of 3+ retrievers; prioritises consensus over ranking precision.</w:t>
+            </w:r>
+          </w:p>
+        </w:tc>
+      </w:tr>
+    </w:tbl>
+    <w:p>
+      <w:pPr>
+        <w:spacing w:after="100"/>
+      </w:pPr>
+    </w:p>
+    <w:p>
+      <w:pPr>
+        <w:pStyle w:val="Heading3"/>
+      </w:pPr>
+      <w:r>
+        <w:t>Relevance to This Solution</w:t>
+      </w:r>
+    </w:p>
+    <w:p>
+      <w:pPr>
+        <w:spacing w:after="140"/>
+      </w:pPr>
+      <w:r>
+        <w:t>The current retrieval stack (FAISS IndexFlatIP) is pure dense vector search. The Best-Practice Alignment table (row 9) explicitly records hybrid lexical + vector as an open gap. BM25 would be most beneficial for queries that reference specific bias names (e.g., “Dunning–Kruger”), author surnames, or dossier titles exactly, because embedding distance may rank a semantically similar but differently-named concept higher than the exact match.</w:t>
+      </w:r>
+    </w:p>
+    <w:p>
+      <w:pPr>
+        <w:spacing w:after="140"/>
+      </w:pPr>
+    </w:p>
+    <w:p>
+      <w:pPr>
+        <w:spacing w:after="140"/>
+      </w:pPr>
+    </w:p>
+    <w:p>
+      <w:pPr>
+        <w:spacing w:after="140"/>
+      </w:pPr>
+    </w:p>
+    <w:tbl>
+      <w:tblPr>
+        <w:tblW w:w="10080" w:type="dxa"/>
+        <w:tblBorders>
+          <w:top w:val="single" w:sz="4" w:space="0" w:color="BE6414"/>
+          <w:left w:val="single" w:sz="4" w:space="0" w:color="BE6414"/>
+          <w:bottom w:val="single" w:sz="4" w:space="0" w:color="BE6414"/>
+          <w:right w:val="single" w:sz="4" w:space="0" w:color="BE6414"/>
+        </w:tblBorders>
+        <w:tblLook w:val="04A0" w:firstRow="1" w:lastRow="0" w:firstColumn="1" w:lastColumn="0" w:noHBand="0" w:noVBand="1"/>
+      </w:tblPr>
+      <w:tblGrid>
+        <w:gridCol w:w="10080"/>
+      </w:tblGrid>
+      <w:tr>
+        <w:tc>
+          <w:tcPr>
+            <w:tcW w:w="10080" w:type="dxa"/>
+            <w:shd w:val="clear" w:color="auto" w:fill="FCE8C4"/>
+            <w:tcMar>
+              <w:top w:w="100" w:type="dxa"/>
+              <w:left w:w="160" w:type="dxa"/>
+              <w:bottom w:w="100" w:type="dxa"/>
+              <w:right w:w="160" w:type="dxa"/>
+            </w:tcMar>
+          </w:tcPr>
+          <w:p>
+            <w:pPr>
+              <w:spacing w:after="80"/>
+            </w:pPr>
+            <w:r>
+              <w:rPr>
+                <w:b/>
+                <w:color w:val="BE6414"/>
+              </w:rPr>
+              <w:t>Ensemble Retrieval — Key Properties</w:t>
+            </w:r>
+          </w:p>
+          <w:p>
+            <w:pPr>
+              <w:numPr>
+                <w:ilvl w:val="0"/>
+                <w:numId w:val="1"/>
+              </w:numPr>
+              <w:spacing w:after="60"/>
+            </w:pPr>
+            <w:r>
+              <w:rPr>
+                <w:sz w:val="20"/>
+              </w:rPr>
+              <w:t>Hybrid BM25 + dense + RRF improves recall by 15–30% over single-method retrieval in benchmarked RAG pipelines (arXiv:2604.01733).</w:t>
+            </w:r>
+          </w:p>
+          <w:p>
+            <w:pPr>
+              <w:numPr>
+                <w:ilvl w:val="0"/>
+                <w:numId w:val="1"/>
+              </w:numPr>
+              <w:spacing w:after="60"/>
+            </w:pPr>
+            <w:r>
+              <w:rPr>
+                <w:sz w:val="20"/>
+              </w:rPr>
+              <w:t>RRF is the preferred fusion method because it is score-scale agnostic and robust across retriever types.</w:t>
+            </w:r>
+          </w:p>
+          <w:p>
+            <w:pPr>
+              <w:numPr>
+                <w:ilvl w:val="0"/>
+                <w:numId w:val="1"/>
+              </w:numPr>
+              <w:spacing w:after="60"/>
+            </w:pPr>
+            <w:r>
+              <w:rPr>
+                <w:sz w:val="20"/>
+              </w:rPr>
+              <w:t>Roadmap for this solution: add BM25 index alongside FAISS; fuse with RRF in rag/retriever.py before the MMR step.</w:t>
+            </w:r>
+          </w:p>
+          <w:p>
+            <w:pPr>
+              <w:numPr>
+                <w:ilvl w:val="0"/>
+                <w:numId w:val="1"/>
+              </w:numPr>
+              <w:spacing w:after="60"/>
+            </w:pPr>
+            <w:r>
+              <w:rPr>
+                <w:sz w:val="20"/>
+              </w:rPr>
+              <w:t>Cross-encoder reranking after fusion adds precision on the final top-K; this is already partially implemented via the optional Claude Haiku reranker (RAG_RERANKER=claude_haiku).</w:t>
+            </w:r>
+          </w:p>
+          <w:p>
+            <w:pPr>
+              <w:numPr>
+                <w:ilvl w:val="0"/>
+                <w:numId w:val="1"/>
+              </w:numPr>
+              <w:spacing w:after="60"/>
+            </w:pPr>
+            <w:r>
+              <w:rPr>
+                <w:sz w:val="20"/>
+              </w:rPr>
+              <w:t>Implementation cost is low: rank_bm25 (Python) can index the same chunk text used for embeddings; no schema changes required.</w:t>
+            </w:r>
+          </w:p>
+        </w:tc>
+      </w:tr>
+    </w:tbl>
+    <w:p>
+      <w:pPr>
+        <w:spacing w:after="200"/>
+      </w:pPr>
+    </w:p>
+    <w:p>
+      <w:pPr>
+        <w:pStyle w:val="Heading2"/>
+      </w:pPr>
+      <w:r>
+        <w:t>5. Technique Composition and Current Implementation Status</w:t>
+      </w:r>
+    </w:p>
+    <w:p>
+      <w:pPr>
+        <w:spacing w:after="140"/>
+      </w:pPr>
+      <w:r>
+        <w:t>These four techniques are not mutually exclusive — they operate at different stages of the retrieval pipeline and can be layered. The table below maps each technique to its pipeline stage, current implementation status in this solution, and roadmap priority.</w:t>
+      </w:r>
+    </w:p>
+    <w:p>
+      <w:pPr>
+        <w:spacing w:before="120" w:after="60"/>
+      </w:pPr>
+      <w:r>
+        <w:rPr>
+          <w:b/>
+          <w:color w:val="1E4078"/>
+        </w:rPr>
+        <w:t>Table: Retrieval Technique — Implementation Status and Roadmap</w:t>
+      </w:r>
+    </w:p>
+    <w:tbl>
+      <w:tblPr>
+        <w:tblW w:w="10080" w:type="dxa"/>
+        <w:tblBorders>
+          <w:top w:val="single" w:sz="2" w:space="0" w:color="CCCCCC"/>
+          <w:left w:val="single" w:sz="2" w:space="0" w:color="CCCCCC"/>
+          <w:bottom w:val="single" w:sz="2" w:space="0" w:color="CCCCCC"/>
+          <w:right w:val="single" w:sz="2" w:space="0" w:color="CCCCCC"/>
+          <w:insideH w:val="single" w:sz="2" w:space="0" w:color="CCCCCC"/>
+          <w:insideV w:val="single" w:sz="2" w:space="0" w:color="CCCCCC"/>
+        </w:tblBorders>
+        <w:tblCellMar>
+          <w:top w:w="80" w:type="dxa"/>
+          <w:left w:w="120" w:type="dxa"/>
+          <w:bottom w:w="80" w:type="dxa"/>
+          <w:right w:w="120" w:type="dxa"/>
+        </w:tblCellMar>
+        <w:tblLook w:val="04A0" w:firstRow="1" w:lastRow="0" w:firstColumn="1" w:lastColumn="0" w:noHBand="0" w:noVBand="1"/>
+      </w:tblPr>
+      <w:tblGrid>
+        <w:gridCol w:w="2200"/>
+        <w:gridCol w:w="2400"/>
+        <w:gridCol w:w="3200"/>
+        <w:gridCol w:w="2280"/>
+      </w:tblGrid>
+      <w:tr>
+        <w:tc>
+          <w:tcPr>
+            <w:tcW w:w="2200" w:type="dxa"/>
+            <w:tcBorders>
+              <w:top w:val="single" w:sz="2" w:space="0" w:color="CCCCCC"/>
+              <w:left w:val="single" w:sz="2" w:space="0" w:color="CCCCCC"/>
+              <w:bottom w:val="single" w:sz="2" w:space="0" w:color="CCCCCC"/>
+              <w:right w:val="single" w:sz="2" w:space="0" w:color="CCCCCC"/>
+            </w:tcBorders>
+            <w:shd w:val="clear" w:color="auto" w:fill="1E4078"/>
+            <w:tcMar>
+              <w:top w:w="80" w:type="dxa"/>
+              <w:left w:w="120" w:type="dxa"/>
+              <w:bottom w:w="80" w:type="dxa"/>
+              <w:right w:w="120" w:type="dxa"/>
+            </w:tcMar>
+          </w:tcPr>
+          <w:p>
+            <w:r>
+              <w:rPr>
+                <w:b/>
+                <w:color w:val="FFFFFF"/>
+              </w:rPr>
+              <w:t>Technique</w:t>
+            </w:r>
+          </w:p>
+        </w:tc>
+        <w:tc>
+          <w:tcPr>
+            <w:tcW w:w="2400" w:type="dxa"/>
+            <w:tcBorders>
+              <w:top w:val="single" w:sz="2" w:space="0" w:color="CCCCCC"/>
+              <w:left w:val="single" w:sz="2" w:space="0" w:color="CCCCCC"/>
+              <w:bottom w:val="single" w:sz="2" w:space="0" w:color="CCCCCC"/>
+              <w:right w:val="single" w:sz="2" w:space="0" w:color="CCCCCC"/>
+            </w:tcBorders>
+            <w:shd w:val="clear" w:color="auto" w:fill="1E4078"/>
+            <w:tcMar>
+              <w:top w:w="80" w:type="dxa"/>
+              <w:left w:w="120" w:type="dxa"/>
+              <w:bottom w:w="80" w:type="dxa"/>
+              <w:right w:w="120" w:type="dxa"/>
+            </w:tcMar>
+          </w:tcPr>
+          <w:p>
+            <w:r>
+              <w:rPr>
+                <w:b/>
+                <w:color w:val="FFFFFF"/>
+              </w:rPr>
+              <w:t>Pipeline Stage</w:t>
+            </w:r>
+          </w:p>
+        </w:tc>
+        <w:tc>
+          <w:tcPr>
+            <w:tcW w:w="3200" w:type="dxa"/>
+            <w:tcBorders>
+              <w:top w:val="single" w:sz="2" w:space="0" w:color="CCCCCC"/>
+              <w:left w:val="single" w:sz="2" w:space="0" w:color="CCCCCC"/>
+              <w:bottom w:val="single" w:sz="2" w:space="0" w:color="CCCCCC"/>
+              <w:right w:val="single" w:sz="2" w:space="0" w:color="CCCCCC"/>
+            </w:tcBorders>
+            <w:shd w:val="clear" w:color="auto" w:fill="1E4078"/>
+            <w:tcMar>
+              <w:top w:w="80" w:type="dxa"/>
+              <w:left w:w="120" w:type="dxa"/>
+              <w:bottom w:w="80" w:type="dxa"/>
+              <w:right w:w="120" w:type="dxa"/>
+            </w:tcMar>
+          </w:tcPr>
+          <w:p>
+            <w:r>
+              <w:rPr>
+                <w:b/>
+                <w:color w:val="FFFFFF"/>
+              </w:rPr>
+              <w:t>Current Status</w:t>
+            </w:r>
+          </w:p>
+        </w:tc>
+        <w:tc>
+          <w:tcPr>
+            <w:tcW w:w="2280" w:type="dxa"/>
+            <w:tcBorders>
+              <w:top w:val="single" w:sz="2" w:space="0" w:color="CCCCCC"/>
+              <w:left w:val="single" w:sz="2" w:space="0" w:color="CCCCCC"/>
+              <w:bottom w:val="single" w:sz="2" w:space="0" w:color="CCCCCC"/>
+              <w:right w:val="single" w:sz="2" w:space="0" w:color="CCCCCC"/>
+            </w:tcBorders>
+            <w:shd w:val="clear" w:color="auto" w:fill="1E4078"/>
+            <w:tcMar>
+              <w:top w:w="80" w:type="dxa"/>
+              <w:left w:w="120" w:type="dxa"/>
+              <w:bottom w:w="80" w:type="dxa"/>
+              <w:right w:w="120" w:type="dxa"/>
+            </w:tcMar>
+          </w:tcPr>
+          <w:p>
+            <w:r>
+              <w:rPr>
+                <w:b/>
+                <w:color w:val="FFFFFF"/>
+              </w:rPr>
+              <w:t>Roadmap</w:t>
+            </w:r>
+          </w:p>
+        </w:tc>
+      </w:tr>
+      <w:tr>
+        <w:tc>
+          <w:tcPr>
+            <w:tcW w:w="2200" w:type="dxa"/>
+            <w:tcBorders>
+              <w:top w:val="single" w:sz="2" w:space="0" w:color="CCCCCC"/>
+              <w:left w:val="single" w:sz="2" w:space="0" w:color="CCCCCC"/>
+              <w:bottom w:val="single" w:sz="2" w:space="0" w:color="CCCCCC"/>
+              <w:right w:val="single" w:sz="2" w:space="0" w:color="CCCCCC"/>
+            </w:tcBorders>
+            <w:shd w:val="clear" w:color="auto" w:fill="FFFFFF"/>
+            <w:tcMar>
+              <w:top w:w="80" w:type="dxa"/>
+              <w:left w:w="120" w:type="dxa"/>
+              <w:bottom w:w="80" w:type="dxa"/>
+              <w:right w:w="120" w:type="dxa"/>
+            </w:tcMar>
+          </w:tcPr>
+          <w:p>
+            <w:r>
+              <w:t>MMR</w:t>
+            </w:r>
+          </w:p>
+        </w:tc>
+        <w:tc>
+          <w:tcPr>
+            <w:tcW w:w="2400" w:type="dxa"/>
+            <w:tcBorders>
+              <w:top w:val="single" w:sz="2" w:space="0" w:color="CCCCCC"/>
+              <w:left w:val="single" w:sz="2" w:space="0" w:color="CCCCCC"/>
+              <w:bottom w:val="single" w:sz="2" w:space="0" w:color="CCCCCC"/>
+              <w:right w:val="single" w:sz="2" w:space="0" w:color="CCCCCC"/>
+            </w:tcBorders>
+            <w:shd w:val="clear" w:color="auto" w:fill="FFFFFF"/>
+            <w:tcMar>
+              <w:top w:w="80" w:type="dxa"/>
+              <w:left w:w="120" w:type="dxa"/>
+              <w:bottom w:w="80" w:type="dxa"/>
+              <w:right w:w="120" w:type="dxa"/>
+            </w:tcMar>
+          </w:tcPr>
+          <w:p>
+            <w:r>
+              <w:t>Post-retrieval re-ranking</w:t>
+            </w:r>
+          </w:p>
+        </w:tc>
+        <w:tc>
+          <w:tcPr>
+            <w:tcW w:w="3200" w:type="dxa"/>
+            <w:tcBorders>
+              <w:top w:val="single" w:sz="2" w:space="0" w:color="CCCCCC"/>
+              <w:left w:val="single" w:sz="2" w:space="0" w:color="CCCCCC"/>
+              <w:bottom w:val="single" w:sz="2" w:space="0" w:color="CCCCCC"/>
+              <w:right w:val="single" w:sz="2" w:space="0" w:color="CCCCCC"/>
+            </w:tcBorders>
+            <w:shd w:val="clear" w:color="auto" w:fill="FFFFFF"/>
+            <w:tcMar>
+              <w:top w:w="80" w:type="dxa"/>
+              <w:left w:w="120" w:type="dxa"/>
+              <w:bottom w:w="80" w:type="dxa"/>
+              <w:right w:w="120" w:type="dxa"/>
+            </w:tcMar>
+          </w:tcPr>
+          <w:p>
+            <w:r>
+              <w:t>Implemented. Controlled via RAG_MMR_LAMBDA (default 0.7). Applied in rag/retriever.py after concept/domain filtering.</w:t>
+            </w:r>
+          </w:p>
+        </w:tc>
+        <w:tc>
+          <w:tcPr>
+            <w:tcW w:w="2280" w:type="dxa"/>
+            <w:tcBorders>
+              <w:top w:val="single" w:sz="2" w:space="0" w:color="CCCCCC"/>
+              <w:left w:val="single" w:sz="2" w:space="0" w:color="CCCCCC"/>
+              <w:bottom w:val="single" w:sz="2" w:space="0" w:color="CCCCCC"/>
+              <w:right w:val="single" w:sz="2" w:space="0" w:color="CCCCCC"/>
+            </w:tcBorders>
+            <w:shd w:val="clear" w:color="auto" w:fill="FFFFFF"/>
+            <w:tcMar>
+              <w:top w:w="80" w:type="dxa"/>
+              <w:left w:w="120" w:type="dxa"/>
+              <w:bottom w:w="80" w:type="dxa"/>
+              <w:right w:w="120" w:type="dxa"/>
+            </w:tcMar>
+          </w:tcPr>
+          <w:p>
+            <w:r>
+              <w:t>Tune λ per query type once evaluation harness produces per-query metrics.</w:t>
+            </w:r>
+          </w:p>
+        </w:tc>
+      </w:tr>
+      <w:tr>
+        <w:tc>
+          <w:tcPr>
+            <w:tcW w:w="2200" w:type="dxa"/>
+            <w:tcBorders>
+              <w:top w:val="single" w:sz="2" w:space="0" w:color="CCCCCC"/>
+              <w:left w:val="single" w:sz="2" w:space="0" w:color="CCCCCC"/>
+              <w:bottom w:val="single" w:sz="2" w:space="0" w:color="CCCCCC"/>
+              <w:right w:val="single" w:sz="2" w:space="0" w:color="CCCCCC"/>
+            </w:tcBorders>
+            <w:shd w:val="clear" w:color="auto" w:fill="F3F4F6"/>
+            <w:tcMar>
+              <w:top w:w="80" w:type="dxa"/>
+              <w:left w:w="120" w:type="dxa"/>
+              <w:bottom w:w="80" w:type="dxa"/>
+              <w:right w:w="120" w:type="dxa"/>
+            </w:tcMar>
+          </w:tcPr>
+          <w:p>
+            <w:r>
+              <w:t>Self-Querying Retriever</w:t>
+            </w:r>
+          </w:p>
+        </w:tc>
+        <w:tc>
+          <w:tcPr>
+            <w:tcW w:w="2400" w:type="dxa"/>
+            <w:tcBorders>
+              <w:top w:val="single" w:sz="2" w:space="0" w:color="CCCCCC"/>
+              <w:left w:val="single" w:sz="2" w:space="0" w:color="CCCCCC"/>
+              <w:bottom w:val="single" w:sz="2" w:space="0" w:color="CCCCCC"/>
+              <w:right w:val="single" w:sz="2" w:space="0" w:color="CCCCCC"/>
+            </w:tcBorders>
+            <w:shd w:val="clear" w:color="auto" w:fill="F3F4F6"/>
+            <w:tcMar>
+              <w:top w:w="80" w:type="dxa"/>
+              <w:left w:w="120" w:type="dxa"/>
+              <w:bottom w:w="80" w:type="dxa"/>
+              <w:right w:w="120" w:type="dxa"/>
+            </w:tcMar>
+          </w:tcPr>
+          <w:p>
+            <w:r>
+              <w:t>Pre-retrieval query parsing</w:t>
+            </w:r>
+          </w:p>
+        </w:tc>
+        <w:tc>
+          <w:tcPr>
+            <w:tcW w:w="3200" w:type="dxa"/>
+            <w:tcBorders>
+              <w:top w:val="single" w:sz="2" w:space="0" w:color="CCCCCC"/>
+              <w:left w:val="single" w:sz="2" w:space="0" w:color="CCCCCC"/>
+              <w:bottom w:val="single" w:sz="2" w:space="0" w:color="CCCCCC"/>
+              <w:right w:val="single" w:sz="2" w:space="0" w:color="CCCCCC"/>
+            </w:tcBorders>
+            <w:shd w:val="clear" w:color="auto" w:fill="F3F4F6"/>
+            <w:tcMar>
+              <w:top w:w="80" w:type="dxa"/>
+              <w:left w:w="120" w:type="dxa"/>
+              <w:bottom w:w="80" w:type="dxa"/>
+              <w:right w:w="120" w:type="dxa"/>
+            </w:tcMar>
+          </w:tcPr>
+          <w:p>
+            <w:r>
+              <w:t>Not yet implemented. Metadata fields (author, year, decision_phase, passage_type) are indexed and ready to filter against.</w:t>
+            </w:r>
+          </w:p>
+        </w:tc>
+        <w:tc>
+          <w:tcPr>
+            <w:tcW w:w="2280" w:type="dxa"/>
+            <w:tcBorders>
+              <w:top w:val="single" w:sz="2" w:space="0" w:color="CCCCCC"/>
+              <w:left w:val="single" w:sz="2" w:space="0" w:color="CCCCCC"/>
+              <w:bottom w:val="single" w:sz="2" w:space="0" w:color="CCCCCC"/>
+              <w:right w:val="single" w:sz="2" w:space="0" w:color="CCCCCC"/>
+            </w:tcBorders>
+            <w:shd w:val="clear" w:color="auto" w:fill="F3F4F6"/>
+            <w:tcMar>
+              <w:top w:w="80" w:type="dxa"/>
+              <w:left w:w="120" w:type="dxa"/>
+              <w:bottom w:w="80" w:type="dxa"/>
+              <w:right w:w="120" w:type="dxa"/>
+            </w:tcMar>
+          </w:tcPr>
+          <w:p>
+            <w:r>
+              <w:t>Phase 5: add once managed vector store replaces in-process FAISS.</w:t>
+            </w:r>
+          </w:p>
+        </w:tc>
+      </w:tr>
+      <w:tr>
+        <w:tc>
+          <w:tcPr>
+            <w:tcW w:w="2200" w:type="dxa"/>
+            <w:tcBorders>
+              <w:top w:val="single" w:sz="2" w:space="0" w:color="CCCCCC"/>
+              <w:left w:val="single" w:sz="2" w:space="0" w:color="CCCCCC"/>
+              <w:bottom w:val="single" w:sz="2" w:space="0" w:color="CCCCCC"/>
+              <w:right w:val="single" w:sz="2" w:space="0" w:color="CCCCCC"/>
+            </w:tcBorders>
+            <w:shd w:val="clear" w:color="auto" w:fill="FFFFFF"/>
+            <w:tcMar>
+              <w:top w:w="80" w:type="dxa"/>
+              <w:left w:w="120" w:type="dxa"/>
+              <w:bottom w:w="80" w:type="dxa"/>
+              <w:right w:w="120" w:type="dxa"/>
+            </w:tcMar>
+          </w:tcPr>
+          <w:p>
+            <w:r>
+              <w:t>Contextual Compression</w:t>
+            </w:r>
+          </w:p>
+        </w:tc>
+        <w:tc>
+          <w:tcPr>
+            <w:tcW w:w="2400" w:type="dxa"/>
+            <w:tcBorders>
+              <w:top w:val="single" w:sz="2" w:space="0" w:color="CCCCCC"/>
+              <w:left w:val="single" w:sz="2" w:space="0" w:color="CCCCCC"/>
+              <w:bottom w:val="single" w:sz="2" w:space="0" w:color="CCCCCC"/>
+              <w:right w:val="single" w:sz="2" w:space="0" w:color="CCCCCC"/>
+            </w:tcBorders>
+            <w:shd w:val="clear" w:color="auto" w:fill="FFFFFF"/>
+            <w:tcMar>
+              <w:top w:w="80" w:type="dxa"/>
+              <w:left w:w="120" w:type="dxa"/>
+              <w:bottom w:w="80" w:type="dxa"/>
+              <w:right w:w="120" w:type="dxa"/>
+            </w:tcMar>
+          </w:tcPr>
+          <w:p>
+            <w:r>
+              <w:t>Post-retrieval context trimming</w:t>
+            </w:r>
+          </w:p>
+        </w:tc>
+        <w:tc>
+          <w:tcPr>
+            <w:tcW w:w="3200" w:type="dxa"/>
+            <w:tcBorders>
+              <w:top w:val="single" w:sz="2" w:space="0" w:color="CCCCCC"/>
+              <w:left w:val="single" w:sz="2" w:space="0" w:color="CCCCCC"/>
+              <w:bottom w:val="single" w:sz="2" w:space="0" w:color="CCCCCC"/>
+              <w:right w:val="single" w:sz="2" w:space="0" w:color="CCCCCC"/>
+            </w:tcBorders>
+            <w:shd w:val="clear" w:color="auto" w:fill="FFFFFF"/>
+            <w:tcMar>
+              <w:top w:w="80" w:type="dxa"/>
+              <w:left w:w="120" w:type="dxa"/>
+              <w:bottom w:w="80" w:type="dxa"/>
+              <w:right w:w="120" w:type="dxa"/>
+            </w:tcMar>
+          </w:tcPr>
+          <w:p>
+            <w:r>
+              <w:t>Partial: format_retrieved_context() manually assembles a compact block. Full LLM-based sentence extraction not yet active.</w:t>
+            </w:r>
+          </w:p>
+        </w:tc>
+        <w:tc>
+          <w:tcPr>
+            <w:tcW w:w="2280" w:type="dxa"/>
+            <w:tcBorders>
+              <w:top w:val="single" w:sz="2" w:space="0" w:color="CCCCCC"/>
+              <w:left w:val="single" w:sz="2" w:space="0" w:color="CCCCCC"/>
+              <w:bottom w:val="single" w:sz="2" w:space="0" w:color="CCCCCC"/>
+              <w:right w:val="single" w:sz="2" w:space="0" w:color="CCCCCC"/>
+            </w:tcBorders>
+            <w:shd w:val="clear" w:color="auto" w:fill="FFFFFF"/>
+            <w:tcMar>
+              <w:top w:w="80" w:type="dxa"/>
+              <w:left w:w="120" w:type="dxa"/>
+              <w:bottom w:w="80" w:type="dxa"/>
+              <w:right w:w="120" w:type="dxa"/>
+            </w:tcMar>
+          </w:tcPr>
+          <w:p>
+            <w:r>
+              <w:t>Phase 5: add LLMChainExtractor (Haiku) when top-K ≥ 8 causes token budget pressure.</w:t>
+            </w:r>
+          </w:p>
+        </w:tc>
+      </w:tr>
+      <w:tr>
+        <w:tc>
+          <w:tcPr>
+            <w:tcW w:w="2200" w:type="dxa"/>
+            <w:tcBorders>
+              <w:top w:val="single" w:sz="2" w:space="0" w:color="CCCCCC"/>
+              <w:left w:val="single" w:sz="2" w:space="0" w:color="CCCCCC"/>
+              <w:bottom w:val="single" w:sz="2" w:space="0" w:color="CCCCCC"/>
+              <w:right w:val="single" w:sz="2" w:space="0" w:color="CCCCCC"/>
+            </w:tcBorders>
+            <w:shd w:val="clear" w:color="auto" w:fill="F3F4F6"/>
+            <w:tcMar>
+              <w:top w:w="80" w:type="dxa"/>
+              <w:left w:w="120" w:type="dxa"/>
+              <w:bottom w:w="80" w:type="dxa"/>
+              <w:right w:w="120" w:type="dxa"/>
+            </w:tcMar>
+          </w:tcPr>
+          <w:p>
+            <w:r>
+              <w:t>Ensemble / Hybrid BM25</w:t>
+            </w:r>
+          </w:p>
+        </w:tc>
+        <w:tc>
+          <w:tcPr>
+            <w:tcW w:w="2400" w:type="dxa"/>
+            <w:tcBorders>
+              <w:top w:val="single" w:sz="2" w:space="0" w:color="CCCCCC"/>
+              <w:left w:val="single" w:sz="2" w:space="0" w:color="CCCCCC"/>
+              <w:bottom w:val="single" w:sz="2" w:space="0" w:color="CCCCCC"/>
+              <w:right w:val="single" w:sz="2" w:space="0" w:color="CCCCCC"/>
+            </w:tcBorders>
+            <w:shd w:val="clear" w:color="auto" w:fill="F3F4F6"/>
+            <w:tcMar>
+              <w:top w:w="80" w:type="dxa"/>
+              <w:left w:w="120" w:type="dxa"/>
+              <w:bottom w:w="80" w:type="dxa"/>
+              <w:right w:w="120" w:type="dxa"/>
+            </w:tcMar>
+          </w:tcPr>
+          <w:p>
+            <w:r>
+              <w:t>Retrieval (parallel to dense)</w:t>
+            </w:r>
+          </w:p>
+        </w:tc>
+        <w:tc>
+          <w:tcPr>
+            <w:tcW w:w="3200" w:type="dxa"/>
+            <w:tcBorders>
+              <w:top w:val="single" w:sz="2" w:space="0" w:color="CCCCCC"/>
+              <w:left w:val="single" w:sz="2" w:space="0" w:color="CCCCCC"/>
+              <w:bottom w:val="single" w:sz="2" w:space="0" w:color="CCCCCC"/>
+              <w:right w:val="single" w:sz="2" w:space="0" w:color="CCCCCC"/>
+            </w:tcBorders>
+            <w:shd w:val="clear" w:color="auto" w:fill="F3F4F6"/>
+            <w:tcMar>
+              <w:top w:w="80" w:type="dxa"/>
+              <w:left w:w="120" w:type="dxa"/>
+              <w:bottom w:w="80" w:type="dxa"/>
+              <w:right w:w="120" w:type="dxa"/>
+            </w:tcMar>
+          </w:tcPr>
+          <w:p>
+            <w:r>
+              <w:t>Not yet implemented. Gap noted in Best-Practice row 9.</w:t>
+            </w:r>
+          </w:p>
+        </w:tc>
+        <w:tc>
+          <w:tcPr>
+            <w:tcW w:w="2280" w:type="dxa"/>
+            <w:tcBorders>
+              <w:top w:val="single" w:sz="2" w:space="0" w:color="CCCCCC"/>
+              <w:left w:val="single" w:sz="2" w:space="0" w:color="CCCCCC"/>
+              <w:bottom w:val="single" w:sz="2" w:space="0" w:color="CCCCCC"/>
+              <w:right w:val="single" w:sz="2" w:space="0" w:color="CCCCCC"/>
+            </w:tcBorders>
+            <w:shd w:val="clear" w:color="auto" w:fill="F3F4F6"/>
+            <w:tcMar>
+              <w:top w:w="80" w:type="dxa"/>
+              <w:left w:w="120" w:type="dxa"/>
+              <w:bottom w:w="80" w:type="dxa"/>
+              <w:right w:w="120" w:type="dxa"/>
+            </w:tcMar>
+          </w:tcPr>
+          <w:p>
+            <w:r>
+              <w:t>Phase 5: add rank_bm25 index; fuse with FAISS results via RRF before MMR step.</w:t>
+            </w:r>
+          </w:p>
+        </w:tc>
+      </w:tr>
+    </w:tbl>
+    <w:p>
+      <w:pPr>
+        <w:spacing w:after="160"/>
+      </w:pPr>
+    </w:p>
+    <w:p>
+      <w:pPr>
+        <w:spacing w:after="200"/>
+      </w:pPr>
+    </w:p>
+    <w:p>
+      <w:pPr>
+        <w:spacing w:after="200"/>
+      </w:pPr>
+    </w:p>
+    <w:p>
+      <w:pPr>
+        <w:spacing w:after="200"/>
+      </w:pPr>
+      <w:r>
+        <w:t>The current retrieval quality is sufficient for the portfolio corpus at its present scale. The Phase 5 roadmap items — hybrid BM25 fusion, self-querying metadata filters, and LLM-based compression — collectively address the scenarios most likely to degrade with corpus growth: exact-term queries, complex multi-constraint queries, and long-context saturation.</w:t>
+      </w:r>
+    </w:p>
+    <w:p>
+      <w:pPr>
+        <w:pStyle w:val="Heading2"/>
+      </w:pPr>
+      <w:r>
+        <w:t>6. Key References</w:t>
+      </w:r>
+    </w:p>
+    <w:p>
+      <w:pPr>
+        <w:numPr>
+          <w:ilvl w:val="0"/>
+          <w:numId w:val="1"/>
+        </w:numPr>
+        <w:spacing w:after="80"/>
+      </w:pPr>
+      <w:r>
+        <w:t>Carbonell, J. &amp; Goldstein, J. (1998). The Use of MMR, Diversity-Based Reranking for Reordering Documents and Producing Summaries. SIGIR 1998, pp. 335–336. ACM. [Foundational MMR paper; 1,000+ citations]</w:t>
+      </w:r>
+    </w:p>
+    <w:p>
+      <w:pPr>
+        <w:numPr>
+          <w:ilvl w:val="0"/>
+          <w:numId w:val="1"/>
+        </w:numPr>
+        <w:spacing w:after="80"/>
+      </w:pPr>
+      <w:r>
+        <w:t>Verma, S. (2024). Contextual Compression in Retrieval-Augmented Generation for Large Language Models: A Survey. arXiv:2409.13385. [Comprehensive taxonomy of compression paradigms for RAG]</w:t>
+      </w:r>
+    </w:p>
+    <w:p>
+      <w:pPr>
+        <w:numPr>
+          <w:ilvl w:val="0"/>
+          <w:numId w:val="1"/>
+        </w:numPr>
+        <w:spacing w:after="80"/>
+      </w:pPr>
+      <w:r>
+        <w:t>Hwang, T. et al. (2024). EXIT: Context-Aware Extractive Compression for Enhancing Retrieval-Augmented Generation. arXiv:2412.12559. [State-of-art extractive compression framework]</w:t>
+      </w:r>
+    </w:p>
+    <w:p>
+      <w:pPr>
+        <w:numPr>
+          <w:ilvl w:val="0"/>
+          <w:numId w:val="1"/>
+        </w:numPr>
+        <w:spacing w:after="80"/>
+      </w:pPr>
+      <w:r>
+        <w:t>Xu, W. et al. (2024). RECOMP: Improving Retrieval-Augmented LMs with Compression and Selective Augmentation. ICLR 2024. [Abstractive compression with fine-tuned compressor]</w:t>
+      </w:r>
+    </w:p>
+    <w:p>
+      <w:pPr>
+        <w:numPr>
+          <w:ilvl w:val="0"/>
+          <w:numId w:val="1"/>
+        </w:numPr>
+        <w:spacing w:after="80"/>
+      </w:pPr>
+      <w:r>
+        <w:t>Sager, C. et al. (2025). From BM25 to Corrective RAG: Benchmarking Retrieval Methods. arXiv:2604.01733. [Hybrid RRF +15–30% recall over single-method retrieval; 23,088-query benchmark]</w:t>
+      </w:r>
+    </w:p>
+    <w:p>
+      <w:pPr>
+        <w:numPr>
+          <w:ilvl w:val="0"/>
+          <w:numId w:val="1"/>
+        </w:numPr>
+        <w:spacing w:after="80"/>
+      </w:pPr>
+      <w:r>
+        <w:t>Elasticsearch Labs (2025). Maximum Marginal Relevance &amp; Elastic: Diversifying Search Results. elastic.co. [Practical λ tuning guidance]</w:t>
+      </w:r>
+    </w:p>
+    <w:p>
+      <w:pPr>
+        <w:numPr>
+          <w:ilvl w:val="0"/>
+          <w:numId w:val="1"/>
+        </w:numPr>
+        <w:spacing w:after="80"/>
+      </w:pPr>
+      <w:r>
+        <w:t>Elasticsearch Labs (2025). LangChain Self-Querying Retriever with Elasticsearch. elastic.co. [Self-querying implementation with metadata filtering]</w:t>
+      </w:r>
+    </w:p>
+    <w:p>
+      <w:pPr>
+        <w:numPr>
+          <w:ilvl w:val="0"/>
+          <w:numId w:val="1"/>
+        </w:numPr>
+        <w:spacing w:after="80"/>
+      </w:pPr>
+      <w:r>
+        <w:t>Van Oudenhove, L. (2024). Enhancing RAG Performance with Metadata: The Power of Self-Query Retrievers. Medium / Towards Data Science. [Metadata filtering patterns]</w:t>
+      </w:r>
+    </w:p>
+    <w:p>
+      <w:pPr>
+        <w:numPr>
+          <w:ilvl w:val="0"/>
+          <w:numId w:val="1"/>
+        </w:numPr>
+        <w:spacing w:after="80"/>
+      </w:pPr>
+      <w:r>
+        <w:t>Ramadurai, S. (2024). Advanced Techniques in RAG: A Deep Dive into MMR, Self-Querying Retrievers, Contextual Compression, and Ensemble Retrieval. DEV Community. [Primary reference article for this section]</w:t>
+      </w:r>
+    </w:p>
+    <w:p>
+      <w:pPr>
+        <w:numPr>
+          <w:ilvl w:val="0"/>
+          <w:numId w:val="1"/>
+        </w:numPr>
+        <w:spacing w:after="80"/>
+      </w:pPr>
+      <w:r>
+        <w:t>LangChain (2026). RAG Case Study: Advanced Retrieval Patterns. Medium. [LLMChainExtractor: 40–65% token reduction, 92–96% accuracy retention]</w:t>
+      </w:r>
+    </w:p>
+    <w:p>
+      <w:pPr>
+        <w:spacing w:after="200"/>
+      </w:pPr>
+    </w:p>
+    <w:p>
+      <w:pPr>
+        <w:spacing w:after="200"/>
+      </w:pPr>
+    </w:p>
+    <w:p>
+      <w:pPr>
+        <w:spacing w:after="200"/>
+      </w:pPr>
+    </w:p>
+    <w:p>
+      <w:pPr>
+        <w:spacing w:after="200"/>
+      </w:pPr>
+    </w:p>
+    <w:p>
+      <w:pPr>
+        <w:spacing w:after="200"/>
+      </w:pPr>
+    </w:p>
+    <w:p>
+      <w:pPr>
+        <w:spacing w:after="200"/>
+      </w:pPr>
+    </w:p>
+    <w:p>
+      <w:pPr>
+        <w:spacing w:after="200"/>
+      </w:pPr>
+    </w:p>
+    <w:p>
+      <w:pPr>
+        <w:spacing w:after="200"/>
+      </w:pPr>
+    </w:p>
+    <w:p>
+      <w:pPr>
+        <w:spacing w:after="200"/>
+      </w:pPr>
+    </w:p>
+    <w:p>
+      <w:pPr>
+        <w:spacing w:after="200"/>
+      </w:pPr>
+    </w:p>
+    <w:p>
+      <w:pPr>
+        <w:spacing w:after="80"/>
+      </w:pPr>
+    </w:p>
+    <w:p>
+      <w:pPr>
+        <w:pStyle w:val="Heading1"/>
+        <w:spacing w:before="320"/>
+      </w:pPr>
+      <w:r>
         <w:t>System Architecture Overview</w:t>
       </w:r>
     </w:p>
@@ -1386,6 +3999,9 @@
         <w:jc w:val="center"/>
       </w:pPr>
       <w:r>
+        <w:rPr>
+          <w:noProof/>
+        </w:rPr>
         <w:drawing>
           <wp:inline distT="0" distB="0" distL="0" distR="0" wp14:anchorId="79B9E459" wp14:editId="00550A85">
             <wp:extent cx="6400800" cy="2048510"/>
@@ -1436,7 +4052,6 @@
           <w:sz w:val="18"/>
           <w:szCs w:val="18"/>
         </w:rPr>
-        <w:lastRenderedPageBreak/>
         <w:t>Figure 2 — Offline pipeline: PDF → parse → chunk → concepts → enrich → FAISS vector index</w:t>
       </w:r>
     </w:p>
@@ -1463,6 +4078,9 @@
         <w:jc w:val="center"/>
       </w:pPr>
       <w:r>
+        <w:rPr>
+          <w:noProof/>
+        </w:rPr>
         <w:drawing>
           <wp:inline distT="0" distB="0" distL="0" distR="0" wp14:anchorId="129DA8FF" wp14:editId="4BF0DECC">
             <wp:extent cx="6400800" cy="2987040"/>
@@ -1513,6 +4131,7 @@
           <w:sz w:val="18"/>
           <w:szCs w:val="18"/>
         </w:rPr>
+        <w:lastRenderedPageBreak/>
         <w:t xml:space="preserve">Figure 3 — Runtime path: concept extraction → retrieval → context assembly → dual LLM calls → response </w:t>
       </w:r>
       <w:proofErr w:type="spellStart"/>
@@ -1543,6 +4162,9 @@
         <w:jc w:val="center"/>
       </w:pPr>
       <w:r>
+        <w:rPr>
+          <w:noProof/>
+        </w:rPr>
         <w:drawing>
           <wp:inline distT="0" distB="0" distL="0" distR="0" wp14:anchorId="76281E3C" wp14:editId="1A6315F3">
             <wp:extent cx="6400800" cy="3034665"/>
@@ -1593,27 +4215,7 @@
           <w:sz w:val="18"/>
           <w:szCs w:val="18"/>
         </w:rPr>
-        <w:t xml:space="preserve">Figure </w:t>
-      </w:r>
-      <w:r>
-        <w:rPr>
-          <w:i/>
-          <w:iCs/>
-          <w:color w:val="6B7280"/>
-          <w:sz w:val="18"/>
-          <w:szCs w:val="18"/>
-        </w:rPr>
-        <w:t>4</w:t>
-      </w:r>
-      <w:r>
-        <w:rPr>
-          <w:i/>
-          <w:iCs/>
-          <w:color w:val="6B7280"/>
-          <w:sz w:val="18"/>
-          <w:szCs w:val="18"/>
-        </w:rPr>
-        <w:t xml:space="preserve"> — GCP deployment: Cloud CDN → Apigee → Cloud Run → FAISS (memory) + GCS → Vertex AI → Secret Manager/Cloud Monitoring/Audit Logs</w:t>
+        <w:t>Figure 4 — GCP deployment: Cloud CDN → Apigee → Cloud Run → FAISS (memory) + GCS → Vertex AI → Secret Manager/Cloud Monitoring/Audit Logs</w:t>
       </w:r>
     </w:p>
     <w:p>
@@ -1622,7 +4224,6 @@
         <w:spacing w:before="320"/>
       </w:pPr>
       <w:r>
-        <w:lastRenderedPageBreak/>
         <w:t>Repository Structure &amp; Module Map</w:t>
       </w:r>
     </w:p>
@@ -1648,12 +4249,6 @@
         <w:gridCol w:w="5913"/>
       </w:tblGrid>
       <w:tr>
-        <w:tblPrEx>
-          <w:tblCellMar>
-            <w:top w:w="0" w:type="dxa"/>
-            <w:bottom w:w="0" w:type="dxa"/>
-          </w:tblCellMar>
-        </w:tblPrEx>
         <w:trPr>
           <w:tblHeader/>
         </w:trPr>
@@ -1719,12 +4314,6 @@
         </w:tc>
       </w:tr>
       <w:tr>
-        <w:tblPrEx>
-          <w:tblCellMar>
-            <w:top w:w="0" w:type="dxa"/>
-            <w:bottom w:w="0" w:type="dxa"/>
-          </w:tblCellMar>
-        </w:tblPrEx>
         <w:tc>
           <w:tcPr>
             <w:tcW w:w="3200" w:type="dxa"/>
@@ -1797,12 +4386,6 @@
         </w:tc>
       </w:tr>
       <w:tr>
-        <w:tblPrEx>
-          <w:tblCellMar>
-            <w:top w:w="0" w:type="dxa"/>
-            <w:bottom w:w="0" w:type="dxa"/>
-          </w:tblCellMar>
-        </w:tblPrEx>
         <w:tc>
           <w:tcPr>
             <w:tcW w:w="3200" w:type="dxa"/>
@@ -1859,12 +4442,6 @@
         </w:tc>
       </w:tr>
       <w:tr>
-        <w:tblPrEx>
-          <w:tblCellMar>
-            <w:top w:w="0" w:type="dxa"/>
-            <w:bottom w:w="0" w:type="dxa"/>
-          </w:tblCellMar>
-        </w:tblPrEx>
         <w:tc>
           <w:tcPr>
             <w:tcW w:w="3200" w:type="dxa"/>
@@ -1969,12 +4546,6 @@
         </w:tc>
       </w:tr>
       <w:tr>
-        <w:tblPrEx>
-          <w:tblCellMar>
-            <w:top w:w="0" w:type="dxa"/>
-            <w:bottom w:w="0" w:type="dxa"/>
-          </w:tblCellMar>
-        </w:tblPrEx>
         <w:tc>
           <w:tcPr>
             <w:tcW w:w="3200" w:type="dxa"/>
@@ -2063,12 +4634,6 @@
         </w:tc>
       </w:tr>
       <w:tr>
-        <w:tblPrEx>
-          <w:tblCellMar>
-            <w:top w:w="0" w:type="dxa"/>
-            <w:bottom w:w="0" w:type="dxa"/>
-          </w:tblCellMar>
-        </w:tblPrEx>
         <w:tc>
           <w:tcPr>
             <w:tcW w:w="3200" w:type="dxa"/>
@@ -2141,12 +4706,6 @@
         </w:tc>
       </w:tr>
       <w:tr>
-        <w:tblPrEx>
-          <w:tblCellMar>
-            <w:top w:w="0" w:type="dxa"/>
-            <w:bottom w:w="0" w:type="dxa"/>
-          </w:tblCellMar>
-        </w:tblPrEx>
         <w:tc>
           <w:tcPr>
             <w:tcW w:w="3200" w:type="dxa"/>
@@ -2251,12 +4810,6 @@
         </w:tc>
       </w:tr>
       <w:tr>
-        <w:tblPrEx>
-          <w:tblCellMar>
-            <w:top w:w="0" w:type="dxa"/>
-            <w:bottom w:w="0" w:type="dxa"/>
-          </w:tblCellMar>
-        </w:tblPrEx>
         <w:tc>
           <w:tcPr>
             <w:tcW w:w="3200" w:type="dxa"/>
@@ -2280,6 +4833,7 @@
                 <w:sz w:val="20"/>
                 <w:szCs w:val="20"/>
               </w:rPr>
+              <w:lastRenderedPageBreak/>
               <w:t>data_pipeline/enrich_chunks.py</w:t>
             </w:r>
           </w:p>
@@ -2377,12 +4931,6 @@
         </w:tc>
       </w:tr>
       <w:tr>
-        <w:tblPrEx>
-          <w:tblCellMar>
-            <w:top w:w="0" w:type="dxa"/>
-            <w:bottom w:w="0" w:type="dxa"/>
-          </w:tblCellMar>
-        </w:tblPrEx>
         <w:tc>
           <w:tcPr>
             <w:tcW w:w="3200" w:type="dxa"/>
@@ -2519,12 +5067,6 @@
         </w:tc>
       </w:tr>
       <w:tr>
-        <w:tblPrEx>
-          <w:tblCellMar>
-            <w:top w:w="0" w:type="dxa"/>
-            <w:bottom w:w="0" w:type="dxa"/>
-          </w:tblCellMar>
-        </w:tblPrEx>
         <w:tc>
           <w:tcPr>
             <w:tcW w:w="3200" w:type="dxa"/>
@@ -2597,12 +5139,6 @@
         </w:tc>
       </w:tr>
       <w:tr>
-        <w:tblPrEx>
-          <w:tblCellMar>
-            <w:top w:w="0" w:type="dxa"/>
-            <w:bottom w:w="0" w:type="dxa"/>
-          </w:tblCellMar>
-        </w:tblPrEx>
         <w:tc>
           <w:tcPr>
             <w:tcW w:w="3200" w:type="dxa"/>
@@ -2659,12 +5195,6 @@
         </w:tc>
       </w:tr>
       <w:tr>
-        <w:tblPrEx>
-          <w:tblCellMar>
-            <w:top w:w="0" w:type="dxa"/>
-            <w:bottom w:w="0" w:type="dxa"/>
-          </w:tblCellMar>
-        </w:tblPrEx>
         <w:tc>
           <w:tcPr>
             <w:tcW w:w="3200" w:type="dxa"/>
@@ -2769,12 +5299,6 @@
         </w:tc>
       </w:tr>
       <w:tr>
-        <w:tblPrEx>
-          <w:tblCellMar>
-            <w:top w:w="0" w:type="dxa"/>
-            <w:bottom w:w="0" w:type="dxa"/>
-          </w:tblCellMar>
-        </w:tblPrEx>
         <w:tc>
           <w:tcPr>
             <w:tcW w:w="3200" w:type="dxa"/>
@@ -2831,12 +5355,6 @@
         </w:tc>
       </w:tr>
       <w:tr>
-        <w:tblPrEx>
-          <w:tblCellMar>
-            <w:top w:w="0" w:type="dxa"/>
-            <w:bottom w:w="0" w:type="dxa"/>
-          </w:tblCellMar>
-        </w:tblPrEx>
         <w:tc>
           <w:tcPr>
             <w:tcW w:w="3200" w:type="dxa"/>
@@ -2925,12 +5443,6 @@
         </w:tc>
       </w:tr>
       <w:tr>
-        <w:tblPrEx>
-          <w:tblCellMar>
-            <w:top w:w="0" w:type="dxa"/>
-            <w:bottom w:w="0" w:type="dxa"/>
-          </w:tblCellMar>
-        </w:tblPrEx>
         <w:tc>
           <w:tcPr>
             <w:tcW w:w="3200" w:type="dxa"/>
@@ -2987,12 +5499,6 @@
         </w:tc>
       </w:tr>
       <w:tr>
-        <w:tblPrEx>
-          <w:tblCellMar>
-            <w:top w:w="0" w:type="dxa"/>
-            <w:bottom w:w="0" w:type="dxa"/>
-          </w:tblCellMar>
-        </w:tblPrEx>
         <w:tc>
           <w:tcPr>
             <w:tcW w:w="3200" w:type="dxa"/>
@@ -3049,12 +5555,6 @@
         </w:tc>
       </w:tr>
       <w:tr>
-        <w:tblPrEx>
-          <w:tblCellMar>
-            <w:top w:w="0" w:type="dxa"/>
-            <w:bottom w:w="0" w:type="dxa"/>
-          </w:tblCellMar>
-        </w:tblPrEx>
         <w:tc>
           <w:tcPr>
             <w:tcW w:w="3200" w:type="dxa"/>
@@ -3143,6 +5643,66 @@
         </w:tc>
       </w:tr>
     </w:tbl>
+    <w:p>
+      <w:pPr>
+        <w:spacing w:after="200"/>
+      </w:pPr>
+    </w:p>
+    <w:p>
+      <w:pPr>
+        <w:spacing w:after="200"/>
+      </w:pPr>
+    </w:p>
+    <w:p>
+      <w:pPr>
+        <w:spacing w:after="200"/>
+      </w:pPr>
+    </w:p>
+    <w:p>
+      <w:pPr>
+        <w:spacing w:after="200"/>
+      </w:pPr>
+    </w:p>
+    <w:p>
+      <w:pPr>
+        <w:spacing w:after="200"/>
+      </w:pPr>
+    </w:p>
+    <w:p>
+      <w:pPr>
+        <w:spacing w:after="200"/>
+      </w:pPr>
+    </w:p>
+    <w:p>
+      <w:pPr>
+        <w:spacing w:after="200"/>
+      </w:pPr>
+    </w:p>
+    <w:p>
+      <w:pPr>
+        <w:spacing w:after="200"/>
+      </w:pPr>
+    </w:p>
+    <w:p>
+      <w:pPr>
+        <w:spacing w:after="200"/>
+      </w:pPr>
+    </w:p>
+    <w:p>
+      <w:pPr>
+        <w:spacing w:after="200"/>
+      </w:pPr>
+    </w:p>
+    <w:p>
+      <w:pPr>
+        <w:spacing w:after="200"/>
+      </w:pPr>
+    </w:p>
+    <w:p>
+      <w:pPr>
+        <w:spacing w:after="200"/>
+      </w:pPr>
+    </w:p>
     <w:p>
       <w:pPr>
         <w:spacing w:after="200"/>
@@ -3213,12 +5773,6 @@
         <w:gridCol w:w="3473"/>
       </w:tblGrid>
       <w:tr>
-        <w:tblPrEx>
-          <w:tblCellMar>
-            <w:top w:w="0" w:type="dxa"/>
-            <w:bottom w:w="0" w:type="dxa"/>
-          </w:tblCellMar>
-        </w:tblPrEx>
         <w:trPr>
           <w:tblHeader/>
         </w:trPr>
@@ -3344,12 +5898,6 @@
         </w:tc>
       </w:tr>
       <w:tr>
-        <w:tblPrEx>
-          <w:tblCellMar>
-            <w:top w:w="0" w:type="dxa"/>
-            <w:bottom w:w="0" w:type="dxa"/>
-          </w:tblCellMar>
-        </w:tblPrEx>
         <w:tc>
           <w:tcPr>
             <w:tcW w:w="400" w:type="dxa"/>
@@ -3476,12 +6024,6 @@
         </w:tc>
       </w:tr>
       <w:tr>
-        <w:tblPrEx>
-          <w:tblCellMar>
-            <w:top w:w="0" w:type="dxa"/>
-            <w:bottom w:w="0" w:type="dxa"/>
-          </w:tblCellMar>
-        </w:tblPrEx>
         <w:tc>
           <w:tcPr>
             <w:tcW w:w="400" w:type="dxa"/>
@@ -3592,12 +6134,6 @@
         </w:tc>
       </w:tr>
       <w:tr>
-        <w:tblPrEx>
-          <w:tblCellMar>
-            <w:top w:w="0" w:type="dxa"/>
-            <w:bottom w:w="0" w:type="dxa"/>
-          </w:tblCellMar>
-        </w:tblPrEx>
         <w:tc>
           <w:tcPr>
             <w:tcW w:w="400" w:type="dxa"/>
@@ -3740,12 +6276,6 @@
         </w:tc>
       </w:tr>
       <w:tr>
-        <w:tblPrEx>
-          <w:tblCellMar>
-            <w:top w:w="0" w:type="dxa"/>
-            <w:bottom w:w="0" w:type="dxa"/>
-          </w:tblCellMar>
-        </w:tblPrEx>
         <w:tc>
           <w:tcPr>
             <w:tcW w:w="400" w:type="dxa"/>
@@ -3872,12 +6402,6 @@
         </w:tc>
       </w:tr>
       <w:tr>
-        <w:tblPrEx>
-          <w:tblCellMar>
-            <w:top w:w="0" w:type="dxa"/>
-            <w:bottom w:w="0" w:type="dxa"/>
-          </w:tblCellMar>
-        </w:tblPrEx>
         <w:tc>
           <w:tcPr>
             <w:tcW w:w="400" w:type="dxa"/>
@@ -4004,12 +6528,6 @@
         </w:tc>
       </w:tr>
       <w:tr>
-        <w:tblPrEx>
-          <w:tblCellMar>
-            <w:top w:w="0" w:type="dxa"/>
-            <w:bottom w:w="0" w:type="dxa"/>
-          </w:tblCellMar>
-        </w:tblPrEx>
         <w:tc>
           <w:tcPr>
             <w:tcW w:w="400" w:type="dxa"/>
@@ -4120,12 +6638,6 @@
         </w:tc>
       </w:tr>
       <w:tr>
-        <w:tblPrEx>
-          <w:tblCellMar>
-            <w:top w:w="0" w:type="dxa"/>
-            <w:bottom w:w="0" w:type="dxa"/>
-          </w:tblCellMar>
-        </w:tblPrEx>
         <w:tc>
           <w:tcPr>
             <w:tcW w:w="400" w:type="dxa"/>
@@ -4284,12 +6796,6 @@
         </w:tc>
       </w:tr>
       <w:tr>
-        <w:tblPrEx>
-          <w:tblCellMar>
-            <w:top w:w="0" w:type="dxa"/>
-            <w:bottom w:w="0" w:type="dxa"/>
-          </w:tblCellMar>
-        </w:tblPrEx>
         <w:tc>
           <w:tcPr>
             <w:tcW w:w="400" w:type="dxa"/>
@@ -4400,12 +6906,6 @@
         </w:tc>
       </w:tr>
       <w:tr>
-        <w:tblPrEx>
-          <w:tblCellMar>
-            <w:top w:w="0" w:type="dxa"/>
-            <w:bottom w:w="0" w:type="dxa"/>
-          </w:tblCellMar>
-        </w:tblPrEx>
         <w:tc>
           <w:tcPr>
             <w:tcW w:w="400" w:type="dxa"/>
@@ -4548,12 +7048,6 @@
         </w:tc>
       </w:tr>
       <w:tr>
-        <w:tblPrEx>
-          <w:tblCellMar>
-            <w:top w:w="0" w:type="dxa"/>
-            <w:bottom w:w="0" w:type="dxa"/>
-          </w:tblCellMar>
-        </w:tblPrEx>
         <w:tc>
           <w:tcPr>
             <w:tcW w:w="400" w:type="dxa"/>
@@ -4696,12 +7190,6 @@
         </w:tc>
       </w:tr>
       <w:tr>
-        <w:tblPrEx>
-          <w:tblCellMar>
-            <w:top w:w="0" w:type="dxa"/>
-            <w:bottom w:w="0" w:type="dxa"/>
-          </w:tblCellMar>
-        </w:tblPrEx>
         <w:tc>
           <w:tcPr>
             <w:tcW w:w="400" w:type="dxa"/>
@@ -4844,12 +7332,6 @@
         </w:tc>
       </w:tr>
       <w:tr>
-        <w:tblPrEx>
-          <w:tblCellMar>
-            <w:top w:w="0" w:type="dxa"/>
-            <w:bottom w:w="0" w:type="dxa"/>
-          </w:tblCellMar>
-        </w:tblPrEx>
         <w:tc>
           <w:tcPr>
             <w:tcW w:w="400" w:type="dxa"/>
@@ -4977,12 +7459,6 @@
         </w:tc>
       </w:tr>
       <w:tr>
-        <w:tblPrEx>
-          <w:tblCellMar>
-            <w:top w:w="0" w:type="dxa"/>
-            <w:bottom w:w="0" w:type="dxa"/>
-          </w:tblCellMar>
-        </w:tblPrEx>
         <w:tc>
           <w:tcPr>
             <w:tcW w:w="400" w:type="dxa"/>
@@ -5093,12 +7569,6 @@
         </w:tc>
       </w:tr>
       <w:tr>
-        <w:tblPrEx>
-          <w:tblCellMar>
-            <w:top w:w="0" w:type="dxa"/>
-            <w:bottom w:w="0" w:type="dxa"/>
-          </w:tblCellMar>
-        </w:tblPrEx>
         <w:tc>
           <w:tcPr>
             <w:tcW w:w="400" w:type="dxa"/>
@@ -5209,12 +7679,6 @@
         </w:tc>
       </w:tr>
       <w:tr>
-        <w:tblPrEx>
-          <w:tblCellMar>
-            <w:top w:w="0" w:type="dxa"/>
-            <w:bottom w:w="0" w:type="dxa"/>
-          </w:tblCellMar>
-        </w:tblPrEx>
         <w:tc>
           <w:tcPr>
             <w:tcW w:w="400" w:type="dxa"/>
@@ -5362,12 +7826,6 @@
         <w:gridCol w:w="3880"/>
       </w:tblGrid>
       <w:tr>
-        <w:tblPrEx>
-          <w:tblCellMar>
-            <w:top w:w="0" w:type="dxa"/>
-            <w:bottom w:w="0" w:type="dxa"/>
-          </w:tblCellMar>
-        </w:tblPrEx>
         <w:trPr>
           <w:tblHeader/>
         </w:trPr>
@@ -5463,12 +7921,6 @@
         </w:tc>
       </w:tr>
       <w:tr>
-        <w:tblPrEx>
-          <w:tblCellMar>
-            <w:top w:w="0" w:type="dxa"/>
-            <w:bottom w:w="0" w:type="dxa"/>
-          </w:tblCellMar>
-        </w:tblPrEx>
         <w:tc>
           <w:tcPr>
             <w:tcW w:w="3400" w:type="dxa"/>
@@ -5552,12 +8004,6 @@
         </w:tc>
       </w:tr>
       <w:tr>
-        <w:tblPrEx>
-          <w:tblCellMar>
-            <w:top w:w="0" w:type="dxa"/>
-            <w:bottom w:w="0" w:type="dxa"/>
-          </w:tblCellMar>
-        </w:tblPrEx>
         <w:tc>
           <w:tcPr>
             <w:tcW w:w="3400" w:type="dxa"/>
@@ -5641,12 +8087,6 @@
         </w:tc>
       </w:tr>
       <w:tr>
-        <w:tblPrEx>
-          <w:tblCellMar>
-            <w:top w:w="0" w:type="dxa"/>
-            <w:bottom w:w="0" w:type="dxa"/>
-          </w:tblCellMar>
-        </w:tblPrEx>
         <w:tc>
           <w:tcPr>
             <w:tcW w:w="3400" w:type="dxa"/>
@@ -5730,12 +8170,6 @@
         </w:tc>
       </w:tr>
       <w:tr>
-        <w:tblPrEx>
-          <w:tblCellMar>
-            <w:top w:w="0" w:type="dxa"/>
-            <w:bottom w:w="0" w:type="dxa"/>
-          </w:tblCellMar>
-        </w:tblPrEx>
         <w:tc>
           <w:tcPr>
             <w:tcW w:w="3400" w:type="dxa"/>
@@ -5819,12 +8253,6 @@
         </w:tc>
       </w:tr>
       <w:tr>
-        <w:tblPrEx>
-          <w:tblCellMar>
-            <w:top w:w="0" w:type="dxa"/>
-            <w:bottom w:w="0" w:type="dxa"/>
-          </w:tblCellMar>
-        </w:tblPrEx>
         <w:tc>
           <w:tcPr>
             <w:tcW w:w="3400" w:type="dxa"/>
@@ -5908,12 +8336,6 @@
         </w:tc>
       </w:tr>
       <w:tr>
-        <w:tblPrEx>
-          <w:tblCellMar>
-            <w:top w:w="0" w:type="dxa"/>
-            <w:bottom w:w="0" w:type="dxa"/>
-          </w:tblCellMar>
-        </w:tblPrEx>
         <w:tc>
           <w:tcPr>
             <w:tcW w:w="3400" w:type="dxa"/>
@@ -5997,12 +8419,6 @@
         </w:tc>
       </w:tr>
       <w:tr>
-        <w:tblPrEx>
-          <w:tblCellMar>
-            <w:top w:w="0" w:type="dxa"/>
-            <w:bottom w:w="0" w:type="dxa"/>
-          </w:tblCellMar>
-        </w:tblPrEx>
         <w:tc>
           <w:tcPr>
             <w:tcW w:w="3400" w:type="dxa"/>
@@ -6086,12 +8502,6 @@
         </w:tc>
       </w:tr>
       <w:tr>
-        <w:tblPrEx>
-          <w:tblCellMar>
-            <w:top w:w="0" w:type="dxa"/>
-            <w:bottom w:w="0" w:type="dxa"/>
-          </w:tblCellMar>
-        </w:tblPrEx>
         <w:tc>
           <w:tcPr>
             <w:tcW w:w="3400" w:type="dxa"/>
@@ -6175,12 +8585,6 @@
         </w:tc>
       </w:tr>
       <w:tr>
-        <w:tblPrEx>
-          <w:tblCellMar>
-            <w:top w:w="0" w:type="dxa"/>
-            <w:bottom w:w="0" w:type="dxa"/>
-          </w:tblCellMar>
-        </w:tblPrEx>
         <w:tc>
           <w:tcPr>
             <w:tcW w:w="3400" w:type="dxa"/>
@@ -6296,12 +8700,6 @@
         </w:tc>
       </w:tr>
       <w:tr>
-        <w:tblPrEx>
-          <w:tblCellMar>
-            <w:top w:w="0" w:type="dxa"/>
-            <w:bottom w:w="0" w:type="dxa"/>
-          </w:tblCellMar>
-        </w:tblPrEx>
         <w:tc>
           <w:tcPr>
             <w:tcW w:w="3400" w:type="dxa"/>
@@ -6401,12 +8799,6 @@
         </w:tc>
       </w:tr>
       <w:tr>
-        <w:tblPrEx>
-          <w:tblCellMar>
-            <w:top w:w="0" w:type="dxa"/>
-            <w:bottom w:w="0" w:type="dxa"/>
-          </w:tblCellMar>
-        </w:tblPrEx>
         <w:tc>
           <w:tcPr>
             <w:tcW w:w="3400" w:type="dxa"/>
@@ -6532,8 +8924,13 @@
         <w:pStyle w:val="Heading1"/>
         <w:spacing w:before="320"/>
       </w:pPr>
-      <w:r>
-        <w:lastRenderedPageBreak/>
+    </w:p>
+    <w:p>
+      <w:pPr>
+        <w:pStyle w:val="Heading1"/>
+        <w:spacing w:before="320"/>
+      </w:pPr>
+      <w:r>
         <w:t>Common Pitfalls &amp; Mitigations</w:t>
       </w:r>
     </w:p>
@@ -6560,12 +8957,6 @@
         <w:gridCol w:w="3480"/>
       </w:tblGrid>
       <w:tr>
-        <w:tblPrEx>
-          <w:tblCellMar>
-            <w:top w:w="0" w:type="dxa"/>
-            <w:bottom w:w="0" w:type="dxa"/>
-          </w:tblCellMar>
-        </w:tblPrEx>
         <w:trPr>
           <w:tblHeader/>
         </w:trPr>
@@ -6661,12 +9052,6 @@
         </w:tc>
       </w:tr>
       <w:tr>
-        <w:tblPrEx>
-          <w:tblCellMar>
-            <w:top w:w="0" w:type="dxa"/>
-            <w:bottom w:w="0" w:type="dxa"/>
-          </w:tblCellMar>
-        </w:tblPrEx>
         <w:tc>
           <w:tcPr>
             <w:tcW w:w="2800" w:type="dxa"/>
@@ -6782,12 +9167,6 @@
         </w:tc>
       </w:tr>
       <w:tr>
-        <w:tblPrEx>
-          <w:tblCellMar>
-            <w:top w:w="0" w:type="dxa"/>
-            <w:bottom w:w="0" w:type="dxa"/>
-          </w:tblCellMar>
-        </w:tblPrEx>
         <w:tc>
           <w:tcPr>
             <w:tcW w:w="2800" w:type="dxa"/>
@@ -6871,12 +9250,6 @@
         </w:tc>
       </w:tr>
       <w:tr>
-        <w:tblPrEx>
-          <w:tblCellMar>
-            <w:top w:w="0" w:type="dxa"/>
-            <w:bottom w:w="0" w:type="dxa"/>
-          </w:tblCellMar>
-        </w:tblPrEx>
         <w:tc>
           <w:tcPr>
             <w:tcW w:w="2800" w:type="dxa"/>
@@ -6960,12 +9333,6 @@
         </w:tc>
       </w:tr>
       <w:tr>
-        <w:tblPrEx>
-          <w:tblCellMar>
-            <w:top w:w="0" w:type="dxa"/>
-            <w:bottom w:w="0" w:type="dxa"/>
-          </w:tblCellMar>
-        </w:tblPrEx>
         <w:tc>
           <w:tcPr>
             <w:tcW w:w="2800" w:type="dxa"/>
@@ -7081,12 +9448,6 @@
         </w:tc>
       </w:tr>
       <w:tr>
-        <w:tblPrEx>
-          <w:tblCellMar>
-            <w:top w:w="0" w:type="dxa"/>
-            <w:bottom w:w="0" w:type="dxa"/>
-          </w:tblCellMar>
-        </w:tblPrEx>
         <w:tc>
           <w:tcPr>
             <w:tcW w:w="2800" w:type="dxa"/>
@@ -7170,12 +9531,6 @@
         </w:tc>
       </w:tr>
       <w:tr>
-        <w:tblPrEx>
-          <w:tblCellMar>
-            <w:top w:w="0" w:type="dxa"/>
-            <w:bottom w:w="0" w:type="dxa"/>
-          </w:tblCellMar>
-        </w:tblPrEx>
         <w:tc>
           <w:tcPr>
             <w:tcW w:w="2800" w:type="dxa"/>
@@ -7275,6 +9630,11 @@
         </w:tc>
       </w:tr>
     </w:tbl>
+    <w:p>
+      <w:pPr>
+        <w:spacing w:after="200"/>
+      </w:pPr>
+    </w:p>
     <w:p>
       <w:pPr>
         <w:spacing w:after="200"/>
@@ -7312,12 +9672,6 @@
         <w:gridCol w:w="5480"/>
       </w:tblGrid>
       <w:tr>
-        <w:tblPrEx>
-          <w:tblCellMar>
-            <w:top w:w="0" w:type="dxa"/>
-            <w:bottom w:w="0" w:type="dxa"/>
-          </w:tblCellMar>
-        </w:tblPrEx>
         <w:trPr>
           <w:tblHeader/>
         </w:trPr>
@@ -7413,12 +9767,6 @@
         </w:tc>
       </w:tr>
       <w:tr>
-        <w:tblPrEx>
-          <w:tblCellMar>
-            <w:top w:w="0" w:type="dxa"/>
-            <w:bottom w:w="0" w:type="dxa"/>
-          </w:tblCellMar>
-        </w:tblPrEx>
         <w:tc>
           <w:tcPr>
             <w:tcW w:w="2400" w:type="dxa"/>
@@ -7502,12 +9850,6 @@
         </w:tc>
       </w:tr>
       <w:tr>
-        <w:tblPrEx>
-          <w:tblCellMar>
-            <w:top w:w="0" w:type="dxa"/>
-            <w:bottom w:w="0" w:type="dxa"/>
-          </w:tblCellMar>
-        </w:tblPrEx>
         <w:tc>
           <w:tcPr>
             <w:tcW w:w="2400" w:type="dxa"/>
@@ -7591,12 +9933,6 @@
         </w:tc>
       </w:tr>
       <w:tr>
-        <w:tblPrEx>
-          <w:tblCellMar>
-            <w:top w:w="0" w:type="dxa"/>
-            <w:bottom w:w="0" w:type="dxa"/>
-          </w:tblCellMar>
-        </w:tblPrEx>
         <w:tc>
           <w:tcPr>
             <w:tcW w:w="2400" w:type="dxa"/>
@@ -7680,12 +10016,6 @@
         </w:tc>
       </w:tr>
       <w:tr>
-        <w:tblPrEx>
-          <w:tblCellMar>
-            <w:top w:w="0" w:type="dxa"/>
-            <w:bottom w:w="0" w:type="dxa"/>
-          </w:tblCellMar>
-        </w:tblPrEx>
         <w:tc>
           <w:tcPr>
             <w:tcW w:w="2400" w:type="dxa"/>
@@ -7785,12 +10115,6 @@
         </w:tc>
       </w:tr>
       <w:tr>
-        <w:tblPrEx>
-          <w:tblCellMar>
-            <w:top w:w="0" w:type="dxa"/>
-            <w:bottom w:w="0" w:type="dxa"/>
-          </w:tblCellMar>
-        </w:tblPrEx>
         <w:tc>
           <w:tcPr>
             <w:tcW w:w="2400" w:type="dxa"/>
@@ -7874,12 +10198,6 @@
         </w:tc>
       </w:tr>
       <w:tr>
-        <w:tblPrEx>
-          <w:tblCellMar>
-            <w:top w:w="0" w:type="dxa"/>
-            <w:bottom w:w="0" w:type="dxa"/>
-          </w:tblCellMar>
-        </w:tblPrEx>
         <w:tc>
           <w:tcPr>
             <w:tcW w:w="2400" w:type="dxa"/>
@@ -7963,12 +10281,6 @@
         </w:tc>
       </w:tr>
       <w:tr>
-        <w:tblPrEx>
-          <w:tblCellMar>
-            <w:top w:w="0" w:type="dxa"/>
-            <w:bottom w:w="0" w:type="dxa"/>
-          </w:tblCellMar>
-        </w:tblPrEx>
         <w:tc>
           <w:tcPr>
             <w:tcW w:w="2400" w:type="dxa"/>
@@ -8052,6 +10364,16 @@
         </w:tc>
       </w:tr>
     </w:tbl>
+    <w:p>
+      <w:pPr>
+        <w:spacing w:after="200"/>
+      </w:pPr>
+    </w:p>
+    <w:p>
+      <w:pPr>
+        <w:spacing w:after="200"/>
+      </w:pPr>
+    </w:p>
     <w:p>
       <w:pPr>
         <w:spacing w:after="200"/>
@@ -8097,7 +10419,6 @@
         <w:spacing w:after="80"/>
       </w:pPr>
       <w:r>
-        <w:lastRenderedPageBreak/>
         <w:t>Curate and govern source content (public dossiers today; private books under strict controls).</w:t>
       </w:r>
     </w:p>
@@ -8431,11 +10752,6 @@
     </w:p>
     <w:p>
       <w:pPr>
-        <w:spacing w:after="200"/>
-      </w:pPr>
-    </w:p>
-    <w:p>
-      <w:pPr>
         <w:pStyle w:val="Heading1"/>
         <w:spacing w:before="320"/>
       </w:pPr>
@@ -8445,20 +10761,7 @@
         <w:pStyle w:val="Heading1"/>
         <w:spacing w:before="320"/>
       </w:pPr>
-    </w:p>
-    <w:p>
-      <w:pPr>
-        <w:pStyle w:val="Heading1"/>
-        <w:spacing w:before="320"/>
-      </w:pPr>
-    </w:p>
-    <w:p>
-      <w:pPr>
-        <w:pStyle w:val="Heading1"/>
-        <w:spacing w:before="320"/>
-      </w:pPr>
-      <w:r>
-        <w:lastRenderedPageBreak/>
+      <w:r>
         <w:t>Architecture Diagrams</w:t>
       </w:r>
     </w:p>
@@ -8485,6 +10788,9 @@
         <w:jc w:val="center"/>
       </w:pPr>
       <w:r>
+        <w:rPr>
+          <w:noProof/>
+        </w:rPr>
         <w:drawing>
           <wp:inline distT="0" distB="0" distL="0" distR="0" wp14:anchorId="6537C950" wp14:editId="3F70E96C">
             <wp:extent cx="6400800" cy="3034665"/>
@@ -8543,7 +10849,62 @@
         <w:pStyle w:val="Heading2"/>
         <w:spacing w:before="240"/>
       </w:pPr>
-      <w:r>
+    </w:p>
+    <w:p>
+      <w:pPr>
+        <w:pStyle w:val="Heading2"/>
+        <w:spacing w:before="240"/>
+      </w:pPr>
+    </w:p>
+    <w:p>
+      <w:pPr>
+        <w:pStyle w:val="Heading2"/>
+        <w:spacing w:before="240"/>
+      </w:pPr>
+    </w:p>
+    <w:p>
+      <w:pPr>
+        <w:pStyle w:val="Heading2"/>
+        <w:spacing w:before="240"/>
+      </w:pPr>
+    </w:p>
+    <w:p>
+      <w:pPr>
+        <w:pStyle w:val="Heading2"/>
+        <w:spacing w:before="240"/>
+      </w:pPr>
+    </w:p>
+    <w:p>
+      <w:pPr>
+        <w:pStyle w:val="Heading2"/>
+        <w:spacing w:before="240"/>
+      </w:pPr>
+    </w:p>
+    <w:p>
+      <w:pPr>
+        <w:pStyle w:val="Heading2"/>
+        <w:spacing w:before="240"/>
+      </w:pPr>
+    </w:p>
+    <w:p>
+      <w:pPr>
+        <w:pStyle w:val="Heading2"/>
+        <w:spacing w:before="240"/>
+      </w:pPr>
+    </w:p>
+    <w:p>
+      <w:pPr>
+        <w:pStyle w:val="Heading2"/>
+        <w:spacing w:before="240"/>
+      </w:pPr>
+    </w:p>
+    <w:p>
+      <w:pPr>
+        <w:pStyle w:val="Heading2"/>
+        <w:spacing w:before="240"/>
+      </w:pPr>
+      <w:r>
+        <w:lastRenderedPageBreak/>
         <w:t>GCP Architecture</w:t>
       </w:r>
     </w:p>
@@ -8561,7 +10922,9 @@
         <w:jc w:val="center"/>
       </w:pPr>
       <w:r>
-        <w:lastRenderedPageBreak/>
+        <w:rPr>
+          <w:noProof/>
+        </w:rPr>
         <w:drawing>
           <wp:inline distT="0" distB="0" distL="0" distR="0" wp14:anchorId="22544DB2" wp14:editId="53CDE858">
             <wp:extent cx="6400800" cy="3231515"/>
@@ -8620,92 +10983,7 @@
         <w:pStyle w:val="Heading2"/>
         <w:spacing w:before="240"/>
       </w:pPr>
-    </w:p>
-    <w:p>
-      <w:pPr>
-        <w:pStyle w:val="Heading2"/>
-        <w:spacing w:before="240"/>
-      </w:pPr>
-    </w:p>
-    <w:p>
-      <w:pPr>
-        <w:pStyle w:val="Heading2"/>
-        <w:spacing w:before="240"/>
-      </w:pPr>
-    </w:p>
-    <w:p>
-      <w:pPr>
-        <w:pStyle w:val="Heading2"/>
-        <w:spacing w:before="240"/>
-      </w:pPr>
-    </w:p>
-    <w:p>
-      <w:pPr>
-        <w:pStyle w:val="Heading2"/>
-        <w:spacing w:before="240"/>
-      </w:pPr>
-    </w:p>
-    <w:p>
-      <w:pPr>
-        <w:pStyle w:val="Heading2"/>
-        <w:spacing w:before="240"/>
-      </w:pPr>
-    </w:p>
-    <w:p>
-      <w:pPr>
-        <w:pStyle w:val="Heading2"/>
-        <w:spacing w:before="240"/>
-      </w:pPr>
-    </w:p>
-    <w:p>
-      <w:pPr>
-        <w:pStyle w:val="Heading2"/>
-        <w:spacing w:before="240"/>
-      </w:pPr>
-    </w:p>
-    <w:p>
-      <w:pPr>
-        <w:pStyle w:val="Heading2"/>
-        <w:spacing w:before="240"/>
-      </w:pPr>
-    </w:p>
-    <w:p>
-      <w:pPr>
-        <w:pStyle w:val="Heading2"/>
-        <w:spacing w:before="240"/>
-      </w:pPr>
-    </w:p>
-    <w:p>
-      <w:pPr>
-        <w:pStyle w:val="Heading2"/>
-        <w:spacing w:before="240"/>
-      </w:pPr>
-    </w:p>
-    <w:p>
-      <w:pPr>
-        <w:pStyle w:val="Heading2"/>
-        <w:spacing w:before="240"/>
-      </w:pPr>
-    </w:p>
-    <w:p>
-      <w:pPr>
-        <w:pStyle w:val="Heading2"/>
-        <w:spacing w:before="240"/>
-      </w:pPr>
-    </w:p>
-    <w:p>
-      <w:pPr>
-        <w:pStyle w:val="Heading2"/>
-        <w:spacing w:before="240"/>
-      </w:pPr>
-    </w:p>
-    <w:p>
-      <w:pPr>
-        <w:pStyle w:val="Heading2"/>
-        <w:spacing w:before="240"/>
-      </w:pPr>
-      <w:r>
-        <w:lastRenderedPageBreak/>
+      <w:r>
         <w:t>Side-by-Side Component Comparison</w:t>
       </w:r>
     </w:p>
@@ -8784,6 +11062,12 @@
         <w:pStyle w:val="Heading1"/>
         <w:spacing w:before="320"/>
       </w:pPr>
+    </w:p>
+    <w:p>
+      <w:pPr>
+        <w:pStyle w:val="Heading1"/>
+        <w:spacing w:before="320"/>
+      </w:pPr>
       <w:r>
         <w:t>FAISS in a Cloud Deployment</w:t>
       </w:r>
@@ -8906,12 +11190,6 @@
         <w:gridCol w:w="10080"/>
       </w:tblGrid>
       <w:tr>
-        <w:tblPrEx>
-          <w:tblCellMar>
-            <w:top w:w="0" w:type="dxa"/>
-            <w:bottom w:w="0" w:type="dxa"/>
-          </w:tblCellMar>
-        </w:tblPrEx>
         <w:tc>
           <w:tcPr>
             <w:tcW w:w="10080" w:type="dxa"/>
@@ -9023,7 +11301,6 @@
         <w:spacing w:before="320"/>
       </w:pPr>
       <w:r>
-        <w:lastRenderedPageBreak/>
         <w:t>Detailed Component Mapping</w:t>
       </w:r>
     </w:p>
@@ -9050,12 +11327,6 @@
         <w:gridCol w:w="3940"/>
       </w:tblGrid>
       <w:tr>
-        <w:tblPrEx>
-          <w:tblCellMar>
-            <w:top w:w="0" w:type="dxa"/>
-            <w:bottom w:w="0" w:type="dxa"/>
-          </w:tblCellMar>
-        </w:tblPrEx>
         <w:trPr>
           <w:tblHeader/>
         </w:trPr>
@@ -9151,12 +11422,6 @@
         </w:tc>
       </w:tr>
       <w:tr>
-        <w:tblPrEx>
-          <w:tblCellMar>
-            <w:top w:w="0" w:type="dxa"/>
-            <w:bottom w:w="0" w:type="dxa"/>
-          </w:tblCellMar>
-        </w:tblPrEx>
         <w:tc>
           <w:tcPr>
             <w:tcW w:w="2200" w:type="dxa"/>
@@ -9240,12 +11505,6 @@
         </w:tc>
       </w:tr>
       <w:tr>
-        <w:tblPrEx>
-          <w:tblCellMar>
-            <w:top w:w="0" w:type="dxa"/>
-            <w:bottom w:w="0" w:type="dxa"/>
-          </w:tblCellMar>
-        </w:tblPrEx>
         <w:tc>
           <w:tcPr>
             <w:tcW w:w="2200" w:type="dxa"/>
@@ -9345,12 +11604,6 @@
         </w:tc>
       </w:tr>
       <w:tr>
-        <w:tblPrEx>
-          <w:tblCellMar>
-            <w:top w:w="0" w:type="dxa"/>
-            <w:bottom w:w="0" w:type="dxa"/>
-          </w:tblCellMar>
-        </w:tblPrEx>
         <w:tc>
           <w:tcPr>
             <w:tcW w:w="2200" w:type="dxa"/>
@@ -9434,12 +11687,6 @@
         </w:tc>
       </w:tr>
       <w:tr>
-        <w:tblPrEx>
-          <w:tblCellMar>
-            <w:top w:w="0" w:type="dxa"/>
-            <w:bottom w:w="0" w:type="dxa"/>
-          </w:tblCellMar>
-        </w:tblPrEx>
         <w:tc>
           <w:tcPr>
             <w:tcW w:w="2200" w:type="dxa"/>
@@ -9523,12 +11770,6 @@
         </w:tc>
       </w:tr>
       <w:tr>
-        <w:tblPrEx>
-          <w:tblCellMar>
-            <w:top w:w="0" w:type="dxa"/>
-            <w:bottom w:w="0" w:type="dxa"/>
-          </w:tblCellMar>
-        </w:tblPrEx>
         <w:tc>
           <w:tcPr>
             <w:tcW w:w="2200" w:type="dxa"/>
@@ -9612,12 +11853,6 @@
         </w:tc>
       </w:tr>
       <w:tr>
-        <w:tblPrEx>
-          <w:tblCellMar>
-            <w:top w:w="0" w:type="dxa"/>
-            <w:bottom w:w="0" w:type="dxa"/>
-          </w:tblCellMar>
-        </w:tblPrEx>
         <w:tc>
           <w:tcPr>
             <w:tcW w:w="2200" w:type="dxa"/>
@@ -9701,12 +11936,6 @@
         </w:tc>
       </w:tr>
       <w:tr>
-        <w:tblPrEx>
-          <w:tblCellMar>
-            <w:top w:w="0" w:type="dxa"/>
-            <w:bottom w:w="0" w:type="dxa"/>
-          </w:tblCellMar>
-        </w:tblPrEx>
         <w:tc>
           <w:tcPr>
             <w:tcW w:w="2200" w:type="dxa"/>
@@ -9790,12 +12019,6 @@
         </w:tc>
       </w:tr>
       <w:tr>
-        <w:tblPrEx>
-          <w:tblCellMar>
-            <w:top w:w="0" w:type="dxa"/>
-            <w:bottom w:w="0" w:type="dxa"/>
-          </w:tblCellMar>
-        </w:tblPrEx>
         <w:tc>
           <w:tcPr>
             <w:tcW w:w="2200" w:type="dxa"/>
@@ -9819,6 +12042,7 @@
                 <w:sz w:val="20"/>
                 <w:szCs w:val="20"/>
               </w:rPr>
+              <w:lastRenderedPageBreak/>
               <w:t>Secrets &amp; credentials</w:t>
             </w:r>
           </w:p>
@@ -9879,12 +12103,6 @@
         </w:tc>
       </w:tr>
       <w:tr>
-        <w:tblPrEx>
-          <w:tblCellMar>
-            <w:top w:w="0" w:type="dxa"/>
-            <w:bottom w:w="0" w:type="dxa"/>
-          </w:tblCellMar>
-        </w:tblPrEx>
         <w:tc>
           <w:tcPr>
             <w:tcW w:w="2200" w:type="dxa"/>
@@ -9968,12 +12186,6 @@
         </w:tc>
       </w:tr>
       <w:tr>
-        <w:tblPrEx>
-          <w:tblCellMar>
-            <w:top w:w="0" w:type="dxa"/>
-            <w:bottom w:w="0" w:type="dxa"/>
-          </w:tblCellMar>
-        </w:tblPrEx>
         <w:tc>
           <w:tcPr>
             <w:tcW w:w="2200" w:type="dxa"/>
@@ -10057,12 +12269,6 @@
         </w:tc>
       </w:tr>
       <w:tr>
-        <w:tblPrEx>
-          <w:tblCellMar>
-            <w:top w:w="0" w:type="dxa"/>
-            <w:bottom w:w="0" w:type="dxa"/>
-          </w:tblCellMar>
-        </w:tblPrEx>
         <w:tc>
           <w:tcPr>
             <w:tcW w:w="2200" w:type="dxa"/>
@@ -10146,12 +12352,6 @@
         </w:tc>
       </w:tr>
       <w:tr>
-        <w:tblPrEx>
-          <w:tblCellMar>
-            <w:top w:w="0" w:type="dxa"/>
-            <w:bottom w:w="0" w:type="dxa"/>
-          </w:tblCellMar>
-        </w:tblPrEx>
         <w:tc>
           <w:tcPr>
             <w:tcW w:w="2200" w:type="dxa"/>
@@ -10235,12 +12435,6 @@
         </w:tc>
       </w:tr>
       <w:tr>
-        <w:tblPrEx>
-          <w:tblCellMar>
-            <w:top w:w="0" w:type="dxa"/>
-            <w:bottom w:w="0" w:type="dxa"/>
-          </w:tblCellMar>
-        </w:tblPrEx>
         <w:tc>
           <w:tcPr>
             <w:tcW w:w="2200" w:type="dxa"/>
@@ -10324,12 +12518,6 @@
         </w:tc>
       </w:tr>
       <w:tr>
-        <w:tblPrEx>
-          <w:tblCellMar>
-            <w:top w:w="0" w:type="dxa"/>
-            <w:bottom w:w="0" w:type="dxa"/>
-          </w:tblCellMar>
-        </w:tblPrEx>
         <w:tc>
           <w:tcPr>
             <w:tcW w:w="2200" w:type="dxa"/>
@@ -10413,12 +12601,6 @@
         </w:tc>
       </w:tr>
       <w:tr>
-        <w:tblPrEx>
-          <w:tblCellMar>
-            <w:top w:w="0" w:type="dxa"/>
-            <w:bottom w:w="0" w:type="dxa"/>
-          </w:tblCellMar>
-        </w:tblPrEx>
         <w:tc>
           <w:tcPr>
             <w:tcW w:w="2200" w:type="dxa"/>
@@ -10509,21 +12691,10 @@
     </w:p>
     <w:p>
       <w:pPr>
-        <w:spacing w:after="200"/>
-      </w:pPr>
-    </w:p>
-    <w:p>
-      <w:pPr>
-        <w:spacing w:after="200"/>
-      </w:pPr>
-    </w:p>
-    <w:p>
-      <w:pPr>
         <w:pStyle w:val="Heading1"/>
         <w:spacing w:before="320"/>
       </w:pPr>
       <w:r>
-        <w:lastRenderedPageBreak/>
         <w:t>Key Differences and Decision Factors</w:t>
       </w:r>
     </w:p>
@@ -10598,6 +12769,16 @@
     </w:p>
     <w:p>
       <w:pPr>
+        <w:spacing w:after="120"/>
+      </w:pPr>
+    </w:p>
+    <w:p>
+      <w:pPr>
+        <w:spacing w:after="120"/>
+      </w:pPr>
+    </w:p>
+    <w:p>
+      <w:pPr>
         <w:pStyle w:val="Heading2"/>
         <w:spacing w:before="240"/>
       </w:pPr>
@@ -10662,26 +12843,10 @@
     </w:p>
     <w:p>
       <w:pPr>
-        <w:spacing w:after="200"/>
-      </w:pPr>
-    </w:p>
-    <w:p>
-      <w:pPr>
-        <w:spacing w:after="200"/>
-      </w:pPr>
-    </w:p>
-    <w:p>
-      <w:pPr>
-        <w:spacing w:after="200"/>
-      </w:pPr>
-    </w:p>
-    <w:p>
-      <w:pPr>
         <w:pStyle w:val="Heading1"/>
         <w:spacing w:before="320"/>
       </w:pPr>
       <w:r>
-        <w:lastRenderedPageBreak/>
         <w:t>Migration Considerations (AWS → GCP or vice versa)</w:t>
       </w:r>
     </w:p>
@@ -10706,12 +12871,6 @@
         <w:gridCol w:w="10080"/>
       </w:tblGrid>
       <w:tr>
-        <w:tblPrEx>
-          <w:tblCellMar>
-            <w:top w:w="0" w:type="dxa"/>
-            <w:bottom w:w="0" w:type="dxa"/>
-          </w:tblCellMar>
-        </w:tblPrEx>
         <w:tc>
           <w:tcPr>
             <w:tcW w:w="10080" w:type="dxa"/>
@@ -10904,6 +13063,7 @@
         <w:spacing w:after="80"/>
       </w:pPr>
       <w:r>
+        <w:lastRenderedPageBreak/>
         <w:t>The deployment must satisfy strict data residency or regulated-industry compliance requirements (VPC Service Controls provide a stronger perimeter than AWS VPC Endpoints).</w:t>
       </w:r>
     </w:p>

</xml_diff>